<commit_message>
Agregue mi experiencia en Oracle
</commit_message>
<xml_diff>
--- a/Francisco Segura CV.docx
+++ b/Francisco Segura CV.docx
@@ -356,101 +356,48 @@
     <w:p>
       <w:pPr>
         <w:pStyle w:val="Heading1"/>
-        <w:ind w:left="119"/>
-        <w:rPr>
-          <w:rFonts w:ascii="Calibri" w:hAnsi="Calibri" w:cs="Calibri"/>
-        </w:rPr>
-      </w:pPr>
-      <w:r>
-        <w:rPr>
-          <w:rFonts w:ascii="Calibri" w:hAnsi="Calibri" w:cs="Calibri"/>
-        </w:rPr>
-        <w:t>Universidad de Guadalajara</w:t>
-      </w:r>
-    </w:p>
-    <w:p>
-      <w:pPr>
-        <w:spacing w:before="91"/>
-        <w:ind w:left="119"/>
+        <w:jc w:val="center"/>
+        <w:rPr>
+          <w:rFonts w:ascii="Calibri" w:hAnsi="Calibri" w:cs="Calibri"/>
+        </w:rPr>
+      </w:pPr>
+      <w:r>
+        <w:rPr>
+          <w:rFonts w:ascii="Calibri" w:hAnsi="Calibri" w:cs="Calibri"/>
+        </w:rPr>
+        <w:t xml:space="preserve">Experience</w:t>
+      </w:r>
+    </w:p>
+    <w:p>
+      <w:pPr>
+        <w:tabs>
+          <w:tab w:val="left" w:pos="9885"/>
+        </w:tabs>
+        <w:spacing w:before="11"/>
+        <w:jc w:val="center"/>
+        <w:rPr>
+          <w:rFonts w:ascii="Calibri" w:hAnsi="Calibri" w:cs="Calibri"/>
+        </w:rPr>
+      </w:pPr>
+      <w:r>
         <w:rPr>
           <w:rFonts w:ascii="Calibri" w:hAnsi="Calibri" w:cs="Calibri"/>
           <w:b/>
         </w:rPr>
-      </w:pPr>
-      <w:r>
-        <w:rPr>
-          <w:rFonts w:ascii="Calibri" w:hAnsi="Calibri" w:cs="Calibri"/>
-        </w:rPr>
-        <w:br w:type="column"/>
+        <w:t xml:space="preserve">Oracle</w:t>
       </w:r>
       <w:r>
         <w:rPr>
           <w:rFonts w:ascii="Calibri" w:hAnsi="Calibri" w:cs="Calibri"/>
           <w:b/>
         </w:rPr>
-        <w:t>Experience</w:t>
-      </w:r>
-    </w:p>
-    <w:p>
-      <w:pPr>
-        <w:pStyle w:val="BodyText"/>
-        <w:spacing w:before="7"/>
-        <w:rPr>
-          <w:rFonts w:ascii="Calibri" w:hAnsi="Calibri" w:cs="Calibri"/>
-          <w:b/>
-          <w:sz w:val="29"/>
-        </w:rPr>
-      </w:pPr>
-      <w:r>
-        <w:rPr>
-          <w:rFonts w:ascii="Calibri" w:hAnsi="Calibri" w:cs="Calibri"/>
-        </w:rPr>
-        <w:br w:type="column"/>
-      </w:r>
-    </w:p>
-    <w:p>
-      <w:pPr>
-        <w:pStyle w:val="BodyText"/>
-        <w:rPr>
-          <w:rFonts w:ascii="Calibri" w:hAnsi="Calibri" w:cs="Calibri"/>
-        </w:rPr>
-        <w:sectPr>
-          <w:type w:val="continuous"/>
-          <w:pgSz w:w="12240" w:h="15840"/>
-          <w:pgMar w:top="1280" w:right="600" w:bottom="280" w:left="600" w:header="720" w:footer="720" w:gutter="0"/>
-          <w:cols w:num="3" w:space="720" w:equalWidth="0">
-            <w:col w:w="1917" w:space="2958"/>
-            <w:col w:w="1211" w:space="2675"/>
-            <w:col w:w="2279"/>
-          </w:cols>
-        </w:sectPr>
-      </w:pPr>
-      <w:r>
-        <w:pict w14:anchorId="06AC2765">
-          <v:shapetype id="_x0000_t202" coordsize="21600,21600" o:spt="202" path="m,l,21600r21600,l21600,xe">
-            <v:stroke joinstyle="miter"/>
-            <v:path gradientshapeok="t" o:connecttype="rect"/>
-          </v:shapetype>
-          <v:shape id="_x0000_s2054" type="#_x0000_t202" style="position:absolute;margin-left:530.25pt;margin-top:1.2pt;width:45.75pt;height:12.2pt;z-index:-1;mso-position-horizontal-relative:page" filled="f" stroked="f">
-            <v:textbox style="mso-next-textbox:#_x0000_s2054" inset="0,0,0,0">
-              <w:txbxContent>
-                <w:p>
-                  <w:pPr>
-                    <w:pStyle w:val="BodyText"/>
-                    <w:spacing w:before="0" w:line="244" w:lineRule="exact"/>
-                  </w:pPr>
-                  <w:r>
-                    <w:rPr>
-                      <w:spacing w:val="-3"/>
-                    </w:rPr>
-                    <w:t>Remote</w:t>
-                  </w:r>
-                </w:p>
-              </w:txbxContent>
-            </v:textbox>
-            <w10:wrap anchorx="page"/>
-          </v:shape>
-        </w:pict>
+        <w:tab/>
+      </w:r>
+      <w:r>
+        <w:rPr>
+          <w:rFonts w:ascii="Calibri" w:hAnsi="Calibri" w:cs="Calibri"/>
+        </w:rPr>
+        <w:t xml:space="preserve">Remote</w:t>
       </w:r>
     </w:p>
     <w:p>
@@ -469,7 +416,7 @@
           <w:rFonts w:ascii="Calibri" w:hAnsi="Calibri" w:cs="Calibri"/>
           <w:b/>
         </w:rPr>
-        <w:t>Internship</w:t>
+        <w:t xml:space="preserve">Software Engineer Intern</w:t>
       </w:r>
       <w:r>
         <w:rPr>
@@ -482,38 +429,29 @@
         <w:rPr>
           <w:rFonts w:ascii="Calibri" w:hAnsi="Calibri" w:cs="Calibri"/>
         </w:rPr>
-        <w:t xml:space="preserve">Sept </w:t>
-      </w:r>
-      <w:r>
-        <w:rPr>
-          <w:rFonts w:ascii="Calibri" w:hAnsi="Calibri" w:cs="Calibri"/>
-        </w:rPr>
-        <w:t>20</w:t>
-      </w:r>
-      <w:r>
-        <w:rPr>
-          <w:rFonts w:ascii="Calibri" w:hAnsi="Calibri" w:cs="Calibri"/>
-        </w:rPr>
-        <w:t>25</w:t>
-      </w:r>
-      <w:r>
-        <w:rPr>
-          <w:rFonts w:ascii="Calibri" w:hAnsi="Calibri" w:cs="Calibri"/>
-          <w:spacing w:val="-6"/>
-        </w:rPr>
-        <w:t xml:space="preserve"> </w:t>
-      </w:r>
-      <w:r>
-        <w:rPr>
-          <w:rFonts w:ascii="Calibri" w:hAnsi="Calibri" w:cs="Calibri"/>
-        </w:rPr>
-        <w:t xml:space="preserve">– </w:t>
-      </w:r>
-      <w:r>
-        <w:rPr>
-          <w:rFonts w:ascii="Calibri" w:hAnsi="Calibri" w:cs="Calibri"/>
-        </w:rPr>
-        <w:t>Present</w:t>
+        <w:t xml:space="preserve">Sept 2025 – Present</w:t>
+      </w:r>
+    </w:p>
+    <w:p>
+      <w:pPr>
+        <w:pStyle w:val="BodyText"/>
+        <w:tabs>
+          <w:tab w:val="left" w:pos="839"/>
+          <w:tab w:val="left" w:pos="840"/>
+        </w:tabs>
+        <w:spacing w:line="249" w:lineRule="auto"/>
+        <w:ind w:right="482"/>
+        <w:rPr>
+          <w:rFonts w:ascii="Calibri" w:hAnsi="Calibri" w:cs="Calibri"/>
+        </w:rPr>
+      </w:pPr>
+      <w:r>
+        <w:rPr>
+          <w:rFonts w:ascii="Calibri" w:hAnsi="Calibri" w:cs="Calibri"/>
+          <w:i/>
+          <w:iCs/>
+        </w:rPr>
+        <w:t xml:space="preserve">Software Engineer experienced in securing, modernizing, and maintaining enterprise diagnostic and fleet-management platforms across Python and Java environments.</w:t>
       </w:r>
     </w:p>
     <w:p>
@@ -527,7 +465,7 @@
           <w:tab w:val="left" w:pos="839"/>
           <w:tab w:val="left" w:pos="840"/>
         </w:tabs>
-        <w:spacing w:line="249" w:lineRule="auto"/>
+        <w:spacing w:line="240" w:lineRule="exact"/>
         <w:ind w:right="482"/>
         <w:rPr>
           <w:rFonts w:ascii="Calibri" w:hAnsi="Calibri" w:cs="Calibri"/>
@@ -537,7 +475,7 @@
         <w:rPr>
           <w:rFonts w:ascii="Calibri" w:hAnsi="Calibri" w:cs="Calibri"/>
         </w:rPr>
-        <w:t>Gathering and definition of system requirements for project scope</w:t>
+        <w:t xml:space="preserve">Investigate complex security and production defects by tracing data flows, execution paths, and trust boundaries.</w:t>
       </w:r>
     </w:p>
     <w:p>
@@ -551,16 +489,17 @@
           <w:tab w:val="left" w:pos="839"/>
           <w:tab w:val="left" w:pos="840"/>
         </w:tabs>
-        <w:spacing w:line="254" w:lineRule="exact"/>
-        <w:rPr>
-          <w:rFonts w:ascii="Calibri" w:hAnsi="Calibri" w:cs="Calibri"/>
-        </w:rPr>
-      </w:pPr>
-      <w:r>
-        <w:rPr>
-          <w:rFonts w:ascii="Calibri" w:hAnsi="Calibri" w:cs="Calibri"/>
-        </w:rPr>
-        <w:t>Design of user interface views with React and backend architecture with Spring Boot</w:t>
+        <w:spacing w:line="240" w:lineRule="exact"/>
+        <w:ind w:right="482"/>
+        <w:rPr>
+          <w:rFonts w:ascii="Calibri" w:hAnsi="Calibri" w:cs="Calibri"/>
+        </w:rPr>
+      </w:pPr>
+      <w:r>
+        <w:rPr>
+          <w:rFonts w:ascii="Calibri" w:hAnsi="Calibri" w:cs="Calibri"/>
+        </w:rPr>
+        <w:t xml:space="preserve">Remediate SQL injection, path traversal, unsafe XML parsing, shell execution, TLS validation, sensitive logging, and access-control weaknesses.</w:t>
       </w:r>
     </w:p>
     <w:p>
@@ -574,16 +513,17 @@
           <w:tab w:val="left" w:pos="839"/>
           <w:tab w:val="left" w:pos="840"/>
         </w:tabs>
-        <w:spacing w:line="264" w:lineRule="exact"/>
-        <w:rPr>
-          <w:rFonts w:ascii="Calibri" w:hAnsi="Calibri" w:cs="Calibri"/>
-        </w:rPr>
-      </w:pPr>
-      <w:r>
-        <w:rPr>
-          <w:rFonts w:ascii="Calibri" w:hAnsi="Calibri" w:cs="Calibri"/>
-        </w:rPr>
-        <w:t>Development and implementation of frontend components using React and Tailwind</w:t>
+        <w:spacing w:line="240" w:lineRule="exact"/>
+        <w:ind w:right="482"/>
+        <w:rPr>
+          <w:rFonts w:ascii="Calibri" w:hAnsi="Calibri" w:cs="Calibri"/>
+        </w:rPr>
+      </w:pPr>
+      <w:r>
+        <w:rPr>
+          <w:rFonts w:ascii="Calibri" w:hAnsi="Calibri" w:cs="Calibri"/>
+        </w:rPr>
+        <w:t xml:space="preserve">Improve system reliability through timeouts, input and file validation, resource controls, and asynchronous-process troubleshooting.</w:t>
       </w:r>
     </w:p>
     <w:p>
@@ -597,22 +537,17 @@
           <w:tab w:val="left" w:pos="839"/>
           <w:tab w:val="left" w:pos="840"/>
         </w:tabs>
-        <w:spacing w:line="267" w:lineRule="exact"/>
-        <w:rPr>
-          <w:rFonts w:ascii="Calibri" w:hAnsi="Calibri" w:cs="Calibri"/>
-        </w:rPr>
-      </w:pPr>
-      <w:r>
-        <w:rPr>
-          <w:rFonts w:ascii="Calibri" w:hAnsi="Calibri" w:cs="Calibri"/>
-        </w:rPr>
-        <w:t xml:space="preserve">Development and integration of backend services using </w:t>
-      </w:r>
-      <w:r>
-        <w:rPr>
-          <w:rFonts w:ascii="Calibri" w:hAnsi="Calibri" w:cs="Calibri"/>
-        </w:rPr>
-        <w:t>Java (Spring Boot)</w:t>
+        <w:spacing w:line="240" w:lineRule="exact"/>
+        <w:ind w:right="482"/>
+        <w:rPr>
+          <w:rFonts w:ascii="Calibri" w:hAnsi="Calibri" w:cs="Calibri"/>
+        </w:rPr>
+      </w:pPr>
+      <w:r>
+        <w:rPr>
+          <w:rFonts w:ascii="Calibri" w:hAnsi="Calibri" w:cs="Calibri"/>
+        </w:rPr>
+        <w:t xml:space="preserve">Modernize legacy code and automated tests using Java, Python, SQL, JUnit, and Mockito.</w:t>
       </w:r>
     </w:p>
     <w:p>
@@ -626,16 +561,17 @@
           <w:tab w:val="left" w:pos="839"/>
           <w:tab w:val="left" w:pos="840"/>
         </w:tabs>
-        <w:spacing w:line="267" w:lineRule="exact"/>
-        <w:rPr>
-          <w:rFonts w:ascii="Calibri" w:hAnsi="Calibri" w:cs="Calibri"/>
-        </w:rPr>
-      </w:pPr>
-      <w:r>
-        <w:rPr>
-          <w:rFonts w:ascii="Calibri" w:hAnsi="Calibri" w:cs="Calibri"/>
-        </w:rPr>
-        <w:t>Implementations of an additional microservice with Node.js (Express)</w:t>
+        <w:spacing w:line="240" w:lineRule="exact"/>
+        <w:ind w:right="482"/>
+        <w:rPr>
+          <w:rFonts w:ascii="Calibri" w:hAnsi="Calibri" w:cs="Calibri"/>
+        </w:rPr>
+      </w:pPr>
+      <w:r>
+        <w:rPr>
+          <w:rFonts w:ascii="Calibri" w:hAnsi="Calibri" w:cs="Calibri"/>
+        </w:rPr>
+        <w:t xml:space="preserve">Strengthen release quality by removing obsolete components, improving packaging, and maintaining configuration assets.</w:t>
       </w:r>
     </w:p>
     <w:p>
@@ -649,46 +585,17 @@
           <w:tab w:val="left" w:pos="839"/>
           <w:tab w:val="left" w:pos="840"/>
         </w:tabs>
-        <w:spacing w:line="267" w:lineRule="exact"/>
-        <w:rPr>
-          <w:rFonts w:ascii="Calibri" w:hAnsi="Calibri" w:cs="Calibri"/>
-        </w:rPr>
-      </w:pPr>
-      <w:r>
-        <w:rPr>
-          <w:rFonts w:ascii="Calibri" w:hAnsi="Calibri" w:cs="Calibri"/>
-        </w:rPr>
-        <w:t>Collaboration in ensuring consistency between design, functionality, and microservices integration</w:t>
-      </w:r>
-    </w:p>
-    <w:p>
-      <w:pPr>
-        <w:pStyle w:val="ListParagraph"/>
-        <w:tabs>
-          <w:tab w:val="left" w:pos="839"/>
-          <w:tab w:val="left" w:pos="840"/>
-        </w:tabs>
-        <w:spacing w:line="267" w:lineRule="exact"/>
-        <w:ind w:left="479" w:firstLine="0"/>
-        <w:rPr>
-          <w:rFonts w:ascii="Calibri" w:hAnsi="Calibri" w:cs="Calibri"/>
-        </w:rPr>
-      </w:pPr>
-    </w:p>
-    <w:p>
-      <w:pPr>
-        <w:pStyle w:val="Heading1"/>
-        <w:spacing w:before="1"/>
-        <w:jc w:val="center"/>
-        <w:rPr>
-          <w:rFonts w:ascii="Calibri" w:hAnsi="Calibri" w:cs="Calibri"/>
-        </w:rPr>
-      </w:pPr>
-      <w:r>
-        <w:rPr>
-          <w:rFonts w:ascii="Calibri" w:hAnsi="Calibri" w:cs="Calibri"/>
-        </w:rPr>
-        <w:t>Academic Projects</w:t>
+        <w:spacing w:line="240" w:lineRule="exact"/>
+        <w:ind w:right="482"/>
+        <w:rPr>
+          <w:rFonts w:ascii="Calibri" w:hAnsi="Calibri" w:cs="Calibri"/>
+        </w:rPr>
+      </w:pPr>
+      <w:r>
+        <w:rPr>
+          <w:rFonts w:ascii="Calibri" w:hAnsi="Calibri" w:cs="Calibri"/>
+        </w:rPr>
+        <w:t xml:space="preserve">Deliver work across the full lifecycle: Jira triage, implementation, security testing, regression validation, code review, QA handoff, and merge preparation.</w:t>
       </w:r>
     </w:p>
     <w:p>
@@ -707,7 +614,7 @@
           <w:rFonts w:ascii="Calibri" w:hAnsi="Calibri" w:cs="Calibri"/>
           <w:b/>
         </w:rPr>
-        <w:t>Ticketmeister</w:t>
+        <w:t xml:space="preserve">Universidad de Guadalajara</w:t>
       </w:r>
       <w:r>
         <w:rPr>
@@ -719,19 +626,17 @@
       <w:r>
         <w:rPr>
           <w:rFonts w:ascii="Calibri" w:hAnsi="Calibri" w:cs="Calibri"/>
-          <w:spacing w:val="-3"/>
-        </w:rPr>
-        <w:t>Remote</w:t>
-      </w:r>
-    </w:p>
-    <w:p>
-      <w:pPr>
-        <w:pStyle w:val="BodyText"/>
-        <w:tabs>
-          <w:tab w:val="left" w:pos="8622"/>
-        </w:tabs>
-        <w:spacing w:line="251" w:lineRule="exact"/>
-        <w:ind w:left="120"/>
+        </w:rPr>
+        <w:t xml:space="preserve">Remote</w:t>
+      </w:r>
+    </w:p>
+    <w:p>
+      <w:pPr>
+        <w:tabs>
+          <w:tab w:val="left" w:pos="8621"/>
+        </w:tabs>
+        <w:spacing w:before="11" w:line="251" w:lineRule="exact"/>
+        <w:ind w:left="174"/>
         <w:rPr>
           <w:rFonts w:ascii="Calibri" w:hAnsi="Calibri" w:cs="Calibri"/>
         </w:rPr>
@@ -741,7 +646,7 @@
           <w:rFonts w:ascii="Calibri" w:hAnsi="Calibri" w:cs="Calibri"/>
           <w:b/>
         </w:rPr>
-        <w:t>Full-stack developer</w:t>
+        <w:t>Internship</w:t>
       </w:r>
       <w:r>
         <w:rPr>
@@ -753,7 +658,25 @@
       <w:r>
         <w:rPr>
           <w:rFonts w:ascii="Calibri" w:hAnsi="Calibri" w:cs="Calibri"/>
-          <w:b/>
+        </w:rPr>
+        <w:t xml:space="preserve">Sept </w:t>
+      </w:r>
+      <w:r>
+        <w:rPr>
+          <w:rFonts w:ascii="Calibri" w:hAnsi="Calibri" w:cs="Calibri"/>
+        </w:rPr>
+        <w:t>20</w:t>
+      </w:r>
+      <w:r>
+        <w:rPr>
+          <w:rFonts w:ascii="Calibri" w:hAnsi="Calibri" w:cs="Calibri"/>
+        </w:rPr>
+        <w:t>25</w:t>
+      </w:r>
+      <w:r>
+        <w:rPr>
+          <w:rFonts w:ascii="Calibri" w:hAnsi="Calibri" w:cs="Calibri"/>
+          <w:spacing w:val="-6"/>
         </w:rPr>
         <w:t xml:space="preserve"> </w:t>
       </w:r>
@@ -761,73 +684,13 @@
         <w:rPr>
           <w:rFonts w:ascii="Calibri" w:hAnsi="Calibri" w:cs="Calibri"/>
         </w:rPr>
-        <w:t>Feb</w:t>
-      </w:r>
-      <w:r>
-        <w:rPr>
-          <w:rFonts w:ascii="Calibri" w:hAnsi="Calibri" w:cs="Calibri"/>
-        </w:rPr>
-        <w:t xml:space="preserve"> </w:t>
-      </w:r>
-      <w:r>
-        <w:rPr>
-          <w:rFonts w:ascii="Calibri" w:hAnsi="Calibri" w:cs="Calibri"/>
-        </w:rPr>
-        <w:t>20</w:t>
-      </w:r>
-      <w:r>
-        <w:rPr>
-          <w:rFonts w:ascii="Calibri" w:hAnsi="Calibri" w:cs="Calibri"/>
-          <w:spacing w:val="-6"/>
-        </w:rPr>
-        <w:t>2</w:t>
-      </w:r>
-      <w:r>
-        <w:rPr>
-          <w:rFonts w:ascii="Calibri" w:hAnsi="Calibri" w:cs="Calibri"/>
-          <w:spacing w:val="-6"/>
-        </w:rPr>
-        <w:t xml:space="preserve">5 </w:t>
-      </w:r>
-      <w:r>
-        <w:rPr>
-          <w:rFonts w:ascii="Calibri" w:hAnsi="Calibri" w:cs="Calibri"/>
-        </w:rPr>
         <w:t xml:space="preserve">– </w:t>
       </w:r>
       <w:r>
         <w:rPr>
           <w:rFonts w:ascii="Calibri" w:hAnsi="Calibri" w:cs="Calibri"/>
         </w:rPr>
-        <w:t>Mar</w:t>
-      </w:r>
-      <w:r>
-        <w:rPr>
-          <w:rFonts w:ascii="Calibri" w:hAnsi="Calibri" w:cs="Calibri"/>
-          <w:spacing w:val="-18"/>
-        </w:rPr>
-        <w:t xml:space="preserve"> </w:t>
-      </w:r>
-      <w:r>
-        <w:rPr>
-          <w:rFonts w:ascii="Calibri" w:hAnsi="Calibri" w:cs="Calibri"/>
-          <w:spacing w:val="-18"/>
-        </w:rPr>
-        <w:t>20</w:t>
-      </w:r>
-      <w:r>
-        <w:rPr>
-          <w:rFonts w:ascii="Calibri" w:hAnsi="Calibri" w:cs="Calibri"/>
-          <w:spacing w:val="-6"/>
-        </w:rPr>
-        <w:t>2</w:t>
-      </w:r>
-      <w:r>
-        <w:rPr>
-          <w:rFonts w:ascii="Calibri" w:hAnsi="Calibri" w:cs="Calibri"/>
-          <w:spacing w:val="-6"/>
-        </w:rPr>
-        <w:t>5</w:t>
+        <w:t>Present</w:t>
       </w:r>
     </w:p>
     <w:p>
@@ -838,20 +701,20 @@
           <w:numId w:val="1"/>
         </w:numPr>
         <w:tabs>
+          <w:tab w:val="left" w:pos="839"/>
           <w:tab w:val="left" w:pos="840"/>
-          <w:tab w:val="left" w:pos="841"/>
-        </w:tabs>
-        <w:spacing w:line="264" w:lineRule="exact"/>
-        <w:ind w:left="840" w:hanging="361"/>
-        <w:rPr>
-          <w:rFonts w:ascii="Calibri" w:hAnsi="Calibri" w:cs="Calibri"/>
-        </w:rPr>
-      </w:pPr>
-      <w:r>
-        <w:rPr>
-          <w:rFonts w:ascii="Calibri" w:hAnsi="Calibri" w:cs="Calibri"/>
-        </w:rPr>
-        <w:t>Developed microservices-based architecture with Python (Flask) for authentication and event management</w:t>
+        </w:tabs>
+        <w:spacing w:line="240" w:lineRule="exact"/>
+        <w:ind w:right="482"/>
+        <w:rPr>
+          <w:rFonts w:ascii="Calibri" w:hAnsi="Calibri" w:cs="Calibri"/>
+        </w:rPr>
+      </w:pPr>
+      <w:r>
+        <w:rPr>
+          <w:rFonts w:ascii="Calibri" w:hAnsi="Calibri" w:cs="Calibri"/>
+        </w:rPr>
+        <w:t>Gathering and definition of system requirements for project scope</w:t>
       </w:r>
     </w:p>
     <w:p>
@@ -862,20 +725,19 @@
           <w:numId w:val="1"/>
         </w:numPr>
         <w:tabs>
+          <w:tab w:val="left" w:pos="839"/>
           <w:tab w:val="left" w:pos="840"/>
-          <w:tab w:val="left" w:pos="841"/>
-        </w:tabs>
-        <w:spacing w:line="249" w:lineRule="auto"/>
-        <w:ind w:left="840" w:right="1064"/>
-        <w:rPr>
-          <w:rFonts w:ascii="Calibri" w:hAnsi="Calibri" w:cs="Calibri"/>
-        </w:rPr>
-      </w:pPr>
-      <w:r>
-        <w:rPr>
-          <w:rFonts w:ascii="Calibri" w:hAnsi="Calibri" w:cs="Calibri"/>
-        </w:rPr>
-        <w:t>Implemented Node.js (Express) service for automated email delivery of purchased tickets</w:t>
+        </w:tabs>
+        <w:spacing w:line="240" w:lineRule="exact"/>
+        <w:rPr>
+          <w:rFonts w:ascii="Calibri" w:hAnsi="Calibri" w:cs="Calibri"/>
+        </w:rPr>
+      </w:pPr>
+      <w:r>
+        <w:rPr>
+          <w:rFonts w:ascii="Calibri" w:hAnsi="Calibri" w:cs="Calibri"/>
+        </w:rPr>
+        <w:t>Design of user interface views with React and backend architecture with Spring Boot</w:t>
       </w:r>
     </w:p>
     <w:p>
@@ -886,20 +748,19 @@
           <w:numId w:val="1"/>
         </w:numPr>
         <w:tabs>
+          <w:tab w:val="left" w:pos="839"/>
           <w:tab w:val="left" w:pos="840"/>
-          <w:tab w:val="left" w:pos="841"/>
-        </w:tabs>
-        <w:spacing w:line="249" w:lineRule="auto"/>
-        <w:ind w:left="840" w:right="1064"/>
-        <w:rPr>
-          <w:rFonts w:ascii="Calibri" w:hAnsi="Calibri" w:cs="Calibri"/>
-        </w:rPr>
-      </w:pPr>
-      <w:r>
-        <w:rPr>
-          <w:rFonts w:ascii="Calibri" w:hAnsi="Calibri" w:cs="Calibri"/>
-        </w:rPr>
-        <w:t>Built frontend application with Angular for browsing and purchasing event tickets</w:t>
+        </w:tabs>
+        <w:spacing w:line="240" w:lineRule="exact"/>
+        <w:rPr>
+          <w:rFonts w:ascii="Calibri" w:hAnsi="Calibri" w:cs="Calibri"/>
+        </w:rPr>
+      </w:pPr>
+      <w:r>
+        <w:rPr>
+          <w:rFonts w:ascii="Calibri" w:hAnsi="Calibri" w:cs="Calibri"/>
+        </w:rPr>
+        <w:t>Development and implementation of frontend components using React and Tailwind</w:t>
       </w:r>
     </w:p>
     <w:p>
@@ -910,20 +771,25 @@
           <w:numId w:val="1"/>
         </w:numPr>
         <w:tabs>
+          <w:tab w:val="left" w:pos="839"/>
           <w:tab w:val="left" w:pos="840"/>
-          <w:tab w:val="left" w:pos="841"/>
-        </w:tabs>
-        <w:spacing w:line="249" w:lineRule="auto"/>
-        <w:ind w:left="840" w:right="1064"/>
-        <w:rPr>
-          <w:rFonts w:ascii="Calibri" w:hAnsi="Calibri" w:cs="Calibri"/>
-        </w:rPr>
-      </w:pPr>
-      <w:r>
-        <w:rPr>
-          <w:rFonts w:ascii="Calibri" w:hAnsi="Calibri" w:cs="Calibri"/>
-        </w:rPr>
-        <w:t>Integrated OpenStreetMap API to display event locations on an interactive map</w:t>
+        </w:tabs>
+        <w:spacing w:line="240" w:lineRule="exact"/>
+        <w:rPr>
+          <w:rFonts w:ascii="Calibri" w:hAnsi="Calibri" w:cs="Calibri"/>
+        </w:rPr>
+      </w:pPr>
+      <w:r>
+        <w:rPr>
+          <w:rFonts w:ascii="Calibri" w:hAnsi="Calibri" w:cs="Calibri"/>
+        </w:rPr>
+        <w:t xml:space="preserve">Development and integration of backend services using </w:t>
+      </w:r>
+      <w:r>
+        <w:rPr>
+          <w:rFonts w:ascii="Calibri" w:hAnsi="Calibri" w:cs="Calibri"/>
+        </w:rPr>
+        <w:t>Java (Spring Boot)</w:t>
       </w:r>
     </w:p>
     <w:p>
@@ -934,161 +800,19 @@
           <w:numId w:val="1"/>
         </w:numPr>
         <w:tabs>
+          <w:tab w:val="left" w:pos="839"/>
           <w:tab w:val="left" w:pos="840"/>
-          <w:tab w:val="left" w:pos="841"/>
-        </w:tabs>
-        <w:spacing w:line="249" w:lineRule="auto"/>
-        <w:ind w:left="840" w:right="1064"/>
-        <w:rPr>
-          <w:rFonts w:ascii="Calibri" w:hAnsi="Calibri" w:cs="Calibri"/>
-        </w:rPr>
-      </w:pPr>
-      <w:r>
-        <w:rPr>
-          <w:rFonts w:ascii="Calibri" w:hAnsi="Calibri" w:cs="Calibri"/>
-        </w:rPr>
-        <w:t xml:space="preserve">Designed </w:t>
-      </w:r>
-      <w:r>
-        <w:rPr>
-          <w:rFonts w:ascii="Calibri" w:hAnsi="Calibri" w:cs="Calibri"/>
-        </w:rPr>
-        <w:t>RESTful APIs to ensure modularity and service scalability</w:t>
-      </w:r>
-    </w:p>
-    <w:p>
-      <w:pPr>
-        <w:pStyle w:val="Heading1"/>
-        <w:spacing w:before="1"/>
-        <w:jc w:val="center"/>
-        <w:rPr>
-          <w:rFonts w:ascii="Calibri" w:hAnsi="Calibri" w:cs="Calibri"/>
-        </w:rPr>
-      </w:pPr>
-    </w:p>
-    <w:p>
-      <w:pPr>
-        <w:tabs>
-          <w:tab w:val="left" w:pos="9885"/>
-        </w:tabs>
-        <w:spacing w:before="11"/>
-        <w:jc w:val="center"/>
-        <w:rPr>
-          <w:rFonts w:ascii="Calibri" w:hAnsi="Calibri" w:cs="Calibri"/>
-        </w:rPr>
-      </w:pPr>
-      <w:r>
-        <w:rPr>
-          <w:rFonts w:ascii="Calibri" w:hAnsi="Calibri" w:cs="Calibri"/>
-          <w:b/>
-        </w:rPr>
-        <w:t>Donactiva</w:t>
-      </w:r>
-      <w:r>
-        <w:rPr>
-          <w:rFonts w:ascii="Calibri" w:hAnsi="Calibri" w:cs="Calibri"/>
-          <w:b/>
-        </w:rPr>
-        <w:tab/>
-      </w:r>
-      <w:r>
-        <w:rPr>
-          <w:rFonts w:ascii="Calibri" w:hAnsi="Calibri" w:cs="Calibri"/>
-          <w:spacing w:val="-3"/>
-        </w:rPr>
-        <w:t>Remote</w:t>
-      </w:r>
-    </w:p>
-    <w:p>
-      <w:pPr>
-        <w:pStyle w:val="BodyText"/>
-        <w:tabs>
-          <w:tab w:val="left" w:pos="8622"/>
-        </w:tabs>
-        <w:spacing w:line="251" w:lineRule="exact"/>
-        <w:ind w:left="120"/>
-        <w:rPr>
-          <w:rFonts w:ascii="Calibri" w:hAnsi="Calibri" w:cs="Calibri"/>
-        </w:rPr>
-      </w:pPr>
-      <w:r>
-        <w:rPr>
-          <w:rFonts w:ascii="Calibri" w:hAnsi="Calibri" w:cs="Calibri"/>
-          <w:b/>
-        </w:rPr>
-        <w:t>Full-stack developer</w:t>
-      </w:r>
-      <w:r>
-        <w:rPr>
-          <w:rFonts w:ascii="Calibri" w:hAnsi="Calibri" w:cs="Calibri"/>
-          <w:b/>
-        </w:rPr>
-        <w:tab/>
-      </w:r>
-      <w:r>
-        <w:rPr>
-          <w:rFonts w:ascii="Calibri" w:hAnsi="Calibri" w:cs="Calibri"/>
-          <w:b/>
-        </w:rPr>
-        <w:t xml:space="preserve"> </w:t>
-      </w:r>
-      <w:r>
-        <w:rPr>
-          <w:rFonts w:ascii="Calibri" w:hAnsi="Calibri" w:cs="Calibri"/>
-        </w:rPr>
-        <w:t>Oct</w:t>
-      </w:r>
-      <w:r>
-        <w:rPr>
-          <w:rFonts w:ascii="Calibri" w:hAnsi="Calibri" w:cs="Calibri"/>
-        </w:rPr>
-        <w:t xml:space="preserve"> </w:t>
-      </w:r>
-      <w:r>
-        <w:rPr>
-          <w:rFonts w:ascii="Calibri" w:hAnsi="Calibri" w:cs="Calibri"/>
-        </w:rPr>
-        <w:t>20</w:t>
-      </w:r>
-      <w:r>
-        <w:rPr>
-          <w:rFonts w:ascii="Calibri" w:hAnsi="Calibri" w:cs="Calibri"/>
-          <w:spacing w:val="-6"/>
-        </w:rPr>
-        <w:t>24</w:t>
-      </w:r>
-      <w:r>
-        <w:rPr>
-          <w:rFonts w:ascii="Calibri" w:hAnsi="Calibri" w:cs="Calibri"/>
-        </w:rPr>
-        <w:t xml:space="preserve">– </w:t>
-      </w:r>
-      <w:r>
-        <w:rPr>
-          <w:rFonts w:ascii="Calibri" w:hAnsi="Calibri" w:cs="Calibri"/>
-        </w:rPr>
-        <w:t>Nov</w:t>
-      </w:r>
-      <w:r>
-        <w:rPr>
-          <w:rFonts w:ascii="Calibri" w:hAnsi="Calibri" w:cs="Calibri"/>
-          <w:spacing w:val="-18"/>
-        </w:rPr>
-        <w:t xml:space="preserve"> </w:t>
-      </w:r>
-      <w:r>
-        <w:rPr>
-          <w:rFonts w:ascii="Calibri" w:hAnsi="Calibri" w:cs="Calibri"/>
-          <w:spacing w:val="-18"/>
-        </w:rPr>
-        <w:t>20</w:t>
-      </w:r>
-      <w:r>
-        <w:rPr>
-          <w:rFonts w:ascii="Calibri" w:hAnsi="Calibri" w:cs="Calibri"/>
-          <w:spacing w:val="-6"/>
-        </w:rPr>
-        <w:t>24</w:t>
+        </w:tabs>
+        <w:spacing w:line="240" w:lineRule="exact"/>
+        <w:rPr>
+          <w:rFonts w:ascii="Calibri" w:hAnsi="Calibri" w:cs="Calibri"/>
+        </w:rPr>
+      </w:pPr>
+      <w:r>
+        <w:rPr>
+          <w:rFonts w:ascii="Calibri" w:hAnsi="Calibri" w:cs="Calibri"/>
+        </w:rPr>
+        <w:t>Implementations of an additional microservice with Node.js (Express)</w:t>
       </w:r>
     </w:p>
     <w:p>
@@ -1099,20 +823,188 @@
           <w:numId w:val="1"/>
         </w:numPr>
         <w:tabs>
+          <w:tab w:val="left" w:pos="839"/>
           <w:tab w:val="left" w:pos="840"/>
-          <w:tab w:val="left" w:pos="841"/>
-        </w:tabs>
-        <w:spacing w:line="264" w:lineRule="exact"/>
-        <w:ind w:left="840" w:hanging="361"/>
-        <w:rPr>
-          <w:rFonts w:ascii="Calibri" w:hAnsi="Calibri" w:cs="Calibri"/>
-        </w:rPr>
-      </w:pPr>
-      <w:r>
-        <w:rPr>
-          <w:rFonts w:ascii="Calibri" w:hAnsi="Calibri" w:cs="Calibri"/>
-        </w:rPr>
-        <w:t>Designed and developed backend logic using Java (Spring Boot) in a monolithic REST API</w:t>
+        </w:tabs>
+        <w:spacing w:line="240" w:lineRule="exact"/>
+        <w:rPr>
+          <w:rFonts w:ascii="Calibri" w:hAnsi="Calibri" w:cs="Calibri"/>
+        </w:rPr>
+      </w:pPr>
+      <w:r>
+        <w:rPr>
+          <w:rFonts w:ascii="Calibri" w:hAnsi="Calibri" w:cs="Calibri"/>
+        </w:rPr>
+        <w:t>Collaboration in ensuring consistency between design, functionality, and microservices integration</w:t>
+      </w:r>
+    </w:p>
+    <w:p>
+      <w:pPr>
+        <w:pStyle w:val="ListParagraph"/>
+        <w:tabs>
+          <w:tab w:val="left" w:pos="839"/>
+          <w:tab w:val="left" w:pos="840"/>
+        </w:tabs>
+        <w:spacing w:line="240" w:lineRule="exact"/>
+        <w:ind w:left="479" w:firstLine="0"/>
+        <w:rPr>
+          <w:rFonts w:ascii="Calibri" w:hAnsi="Calibri" w:cs="Calibri"/>
+        </w:rPr>
+      </w:pPr>
+    </w:p>
+    <w:p>
+      <w:pPr>
+        <w:pStyle w:val="Heading1"/>
+        <w:spacing w:before="1"/>
+        <w:jc w:val="center"/>
+        <w:rPr>
+          <w:rFonts w:ascii="Calibri" w:hAnsi="Calibri" w:cs="Calibri"/>
+        </w:rPr>
+      </w:pPr>
+      <w:r>
+        <w:rPr>
+          <w:rFonts w:ascii="Calibri" w:hAnsi="Calibri" w:cs="Calibri"/>
+        </w:rPr>
+        <w:t>Academic Projects</w:t>
+      </w:r>
+    </w:p>
+    <w:p>
+      <w:pPr>
+        <w:tabs>
+          <w:tab w:val="left" w:pos="9885"/>
+        </w:tabs>
+        <w:spacing w:before="11"/>
+        <w:jc w:val="center"/>
+        <w:rPr>
+          <w:rFonts w:ascii="Calibri" w:hAnsi="Calibri" w:cs="Calibri"/>
+        </w:rPr>
+      </w:pPr>
+      <w:r>
+        <w:rPr>
+          <w:rFonts w:ascii="Calibri" w:hAnsi="Calibri" w:cs="Calibri"/>
+          <w:b/>
+        </w:rPr>
+        <w:t>Ticketmeister</w:t>
+      </w:r>
+      <w:r>
+        <w:rPr>
+          <w:rFonts w:ascii="Calibri" w:hAnsi="Calibri" w:cs="Calibri"/>
+          <w:b/>
+        </w:rPr>
+        <w:tab/>
+      </w:r>
+      <w:r>
+        <w:rPr>
+          <w:rFonts w:ascii="Calibri" w:hAnsi="Calibri" w:cs="Calibri"/>
+          <w:spacing w:val="-3"/>
+        </w:rPr>
+        <w:t>Remote</w:t>
+      </w:r>
+    </w:p>
+    <w:p>
+      <w:pPr>
+        <w:pStyle w:val="BodyText"/>
+        <w:tabs>
+          <w:tab w:val="left" w:pos="8622"/>
+        </w:tabs>
+        <w:spacing w:line="251" w:lineRule="exact"/>
+        <w:ind w:left="120"/>
+        <w:rPr>
+          <w:rFonts w:ascii="Calibri" w:hAnsi="Calibri" w:cs="Calibri"/>
+        </w:rPr>
+      </w:pPr>
+      <w:r>
+        <w:rPr>
+          <w:rFonts w:ascii="Calibri" w:hAnsi="Calibri" w:cs="Calibri"/>
+          <w:b/>
+        </w:rPr>
+        <w:t>Full-stack developer</w:t>
+      </w:r>
+      <w:r>
+        <w:rPr>
+          <w:rFonts w:ascii="Calibri" w:hAnsi="Calibri" w:cs="Calibri"/>
+          <w:b/>
+        </w:rPr>
+        <w:tab/>
+      </w:r>
+      <w:r>
+        <w:rPr>
+          <w:rFonts w:ascii="Calibri" w:hAnsi="Calibri" w:cs="Calibri"/>
+          <w:b/>
+        </w:rPr>
+        <w:t xml:space="preserve"> </w:t>
+      </w:r>
+      <w:r>
+        <w:rPr>
+          <w:rFonts w:ascii="Calibri" w:hAnsi="Calibri" w:cs="Calibri"/>
+        </w:rPr>
+        <w:t>Feb</w:t>
+      </w:r>
+      <w:r>
+        <w:rPr>
+          <w:rFonts w:ascii="Calibri" w:hAnsi="Calibri" w:cs="Calibri"/>
+        </w:rPr>
+        <w:t xml:space="preserve"> </w:t>
+      </w:r>
+      <w:r>
+        <w:rPr>
+          <w:rFonts w:ascii="Calibri" w:hAnsi="Calibri" w:cs="Calibri"/>
+        </w:rPr>
+        <w:t>20</w:t>
+      </w:r>
+      <w:r>
+        <w:rPr>
+          <w:rFonts w:ascii="Calibri" w:hAnsi="Calibri" w:cs="Calibri"/>
+          <w:spacing w:val="-6"/>
+        </w:rPr>
+        <w:t>2</w:t>
+      </w:r>
+      <w:r>
+        <w:rPr>
+          <w:rFonts w:ascii="Calibri" w:hAnsi="Calibri" w:cs="Calibri"/>
+          <w:spacing w:val="-6"/>
+        </w:rPr>
+        <w:t xml:space="preserve">5 </w:t>
+      </w:r>
+      <w:r>
+        <w:rPr>
+          <w:rFonts w:ascii="Calibri" w:hAnsi="Calibri" w:cs="Calibri"/>
+        </w:rPr>
+        <w:t xml:space="preserve">– </w:t>
+      </w:r>
+      <w:r>
+        <w:rPr>
+          <w:rFonts w:ascii="Calibri" w:hAnsi="Calibri" w:cs="Calibri"/>
+        </w:rPr>
+        <w:t>Mar</w:t>
+      </w:r>
+      <w:r>
+        <w:rPr>
+          <w:rFonts w:ascii="Calibri" w:hAnsi="Calibri" w:cs="Calibri"/>
+          <w:spacing w:val="-18"/>
+        </w:rPr>
+        <w:t xml:space="preserve"> </w:t>
+      </w:r>
+      <w:r>
+        <w:rPr>
+          <w:rFonts w:ascii="Calibri" w:hAnsi="Calibri" w:cs="Calibri"/>
+          <w:spacing w:val="-18"/>
+        </w:rPr>
+        <w:t>20</w:t>
+      </w:r>
+      <w:r>
+        <w:rPr>
+          <w:rFonts w:ascii="Calibri" w:hAnsi="Calibri" w:cs="Calibri"/>
+          <w:spacing w:val="-6"/>
+        </w:rPr>
+        <w:t>2</w:t>
+      </w:r>
+      <w:r>
+        <w:rPr>
+          <w:rFonts w:ascii="Calibri" w:hAnsi="Calibri" w:cs="Calibri"/>
+          <w:spacing w:val="-6"/>
+        </w:rPr>
+        <w:t>5</w:t>
       </w:r>
     </w:p>
     <w:p>
@@ -1126,17 +1018,17 @@
           <w:tab w:val="left" w:pos="840"/>
           <w:tab w:val="left" w:pos="841"/>
         </w:tabs>
-        <w:spacing w:line="249" w:lineRule="auto"/>
-        <w:ind w:left="840" w:right="1064"/>
-        <w:rPr>
-          <w:rFonts w:ascii="Calibri" w:hAnsi="Calibri" w:cs="Calibri"/>
-        </w:rPr>
-      </w:pPr>
-      <w:r>
-        <w:rPr>
-          <w:rFonts w:ascii="Calibri" w:hAnsi="Calibri" w:cs="Calibri"/>
-        </w:rPr>
-        <w:t>Implemented dynamic map integration with Google Maps API to display registered charity institutions</w:t>
+        <w:spacing w:line="240" w:lineRule="exact"/>
+        <w:ind w:left="840" w:hanging="361"/>
+        <w:rPr>
+          <w:rFonts w:ascii="Calibri" w:hAnsi="Calibri" w:cs="Calibri"/>
+        </w:rPr>
+      </w:pPr>
+      <w:r>
+        <w:rPr>
+          <w:rFonts w:ascii="Calibri" w:hAnsi="Calibri" w:cs="Calibri"/>
+        </w:rPr>
+        <w:t>Developed microservices-based architecture with Python (Flask) for authentication and event management</w:t>
       </w:r>
     </w:p>
     <w:p>
@@ -1150,7 +1042,7 @@
           <w:tab w:val="left" w:pos="840"/>
           <w:tab w:val="left" w:pos="841"/>
         </w:tabs>
-        <w:spacing w:line="249" w:lineRule="auto"/>
+        <w:spacing w:line="240" w:lineRule="exact"/>
         <w:ind w:left="840" w:right="1064"/>
         <w:rPr>
           <w:rFonts w:ascii="Calibri" w:hAnsi="Calibri" w:cs="Calibri"/>
@@ -1160,7 +1052,7 @@
         <w:rPr>
           <w:rFonts w:ascii="Calibri" w:hAnsi="Calibri" w:cs="Calibri"/>
         </w:rPr>
-        <w:t>Developed donation flow with item selection and QR code generation for validation</w:t>
+        <w:t>Implemented Node.js (Express) service for automated email delivery of purchased tickets</w:t>
       </w:r>
     </w:p>
     <w:p>
@@ -1174,7 +1066,7 @@
           <w:tab w:val="left" w:pos="840"/>
           <w:tab w:val="left" w:pos="841"/>
         </w:tabs>
-        <w:spacing w:line="249" w:lineRule="auto"/>
+        <w:spacing w:line="240" w:lineRule="exact"/>
         <w:ind w:left="840" w:right="1064"/>
         <w:rPr>
           <w:rFonts w:ascii="Calibri" w:hAnsi="Calibri" w:cs="Calibri"/>
@@ -1184,13 +1076,7 @@
         <w:rPr>
           <w:rFonts w:ascii="Calibri" w:hAnsi="Calibri" w:cs="Calibri"/>
         </w:rPr>
-        <w:t xml:space="preserve">Built frontend interface using HTML, CSS, and </w:t>
-      </w:r>
-      <w:r>
-        <w:rPr>
-          <w:rFonts w:ascii="Calibri" w:hAnsi="Calibri" w:cs="Calibri"/>
-        </w:rPr>
-        <w:t>JavaScript</w:t>
+        <w:t>Built frontend application with Angular for browsing and purchasing event tickets</w:t>
       </w:r>
     </w:p>
     <w:p>
@@ -1204,7 +1090,7 @@
           <w:tab w:val="left" w:pos="840"/>
           <w:tab w:val="left" w:pos="841"/>
         </w:tabs>
-        <w:spacing w:line="249" w:lineRule="auto"/>
+        <w:spacing w:line="240" w:lineRule="exact"/>
         <w:ind w:left="840" w:right="1064"/>
         <w:rPr>
           <w:rFonts w:ascii="Calibri" w:hAnsi="Calibri" w:cs="Calibri"/>
@@ -1214,7 +1100,7 @@
         <w:rPr>
           <w:rFonts w:ascii="Calibri" w:hAnsi="Calibri" w:cs="Calibri"/>
         </w:rPr>
-        <w:t>Integrated token-based authentication with JWT for secure user sessions</w:t>
+        <w:t>Integrated OpenStreetMap API to display event locations on an interactive map</w:t>
       </w:r>
     </w:p>
     <w:p>
@@ -1228,7 +1114,7 @@
           <w:tab w:val="left" w:pos="840"/>
           <w:tab w:val="left" w:pos="841"/>
         </w:tabs>
-        <w:spacing w:line="249" w:lineRule="auto"/>
+        <w:spacing w:line="240" w:lineRule="exact"/>
         <w:ind w:left="840" w:right="1064"/>
         <w:rPr>
           <w:rFonts w:ascii="Calibri" w:hAnsi="Calibri" w:cs="Calibri"/>
@@ -1238,28 +1124,299 @@
         <w:rPr>
           <w:rFonts w:ascii="Calibri" w:hAnsi="Calibri" w:cs="Calibri"/>
         </w:rPr>
+        <w:t xml:space="preserve">Designed </w:t>
+      </w:r>
+      <w:r>
+        <w:rPr>
+          <w:rFonts w:ascii="Calibri" w:hAnsi="Calibri" w:cs="Calibri"/>
+        </w:rPr>
+        <w:t>RESTful APIs to ensure modularity and service scalability</w:t>
+      </w:r>
+    </w:p>
+    <w:p>
+      <w:pPr>
+        <w:pStyle w:val="Heading1"/>
+        <w:spacing w:before="1"/>
+        <w:jc w:val="center"/>
+        <w:rPr>
+          <w:rFonts w:ascii="Calibri" w:hAnsi="Calibri" w:cs="Calibri"/>
+        </w:rPr>
+      </w:pPr>
+    </w:p>
+    <w:p>
+      <w:pPr>
+        <w:tabs>
+          <w:tab w:val="left" w:pos="9885"/>
+        </w:tabs>
+        <w:spacing w:before="11"/>
+        <w:jc w:val="center"/>
+        <w:rPr>
+          <w:rFonts w:ascii="Calibri" w:hAnsi="Calibri" w:cs="Calibri"/>
+        </w:rPr>
+      </w:pPr>
+      <w:r>
+        <w:rPr>
+          <w:rFonts w:ascii="Calibri" w:hAnsi="Calibri" w:cs="Calibri"/>
+          <w:b/>
+        </w:rPr>
+        <w:t>Donactiva</w:t>
+      </w:r>
+      <w:r>
+        <w:rPr>
+          <w:rFonts w:ascii="Calibri" w:hAnsi="Calibri" w:cs="Calibri"/>
+          <w:b/>
+        </w:rPr>
+        <w:tab/>
+      </w:r>
+      <w:r>
+        <w:rPr>
+          <w:rFonts w:ascii="Calibri" w:hAnsi="Calibri" w:cs="Calibri"/>
+          <w:spacing w:val="-3"/>
+        </w:rPr>
+        <w:t>Remote</w:t>
+      </w:r>
+    </w:p>
+    <w:p>
+      <w:pPr>
+        <w:pStyle w:val="BodyText"/>
+        <w:tabs>
+          <w:tab w:val="left" w:pos="8622"/>
+        </w:tabs>
+        <w:spacing w:line="251" w:lineRule="exact"/>
+        <w:ind w:left="120"/>
+        <w:rPr>
+          <w:rFonts w:ascii="Calibri" w:hAnsi="Calibri" w:cs="Calibri"/>
+        </w:rPr>
+      </w:pPr>
+      <w:r>
+        <w:rPr>
+          <w:rFonts w:ascii="Calibri" w:hAnsi="Calibri" w:cs="Calibri"/>
+          <w:b/>
+        </w:rPr>
+        <w:t>Full-stack developer</w:t>
+      </w:r>
+      <w:r>
+        <w:rPr>
+          <w:rFonts w:ascii="Calibri" w:hAnsi="Calibri" w:cs="Calibri"/>
+          <w:b/>
+        </w:rPr>
+        <w:tab/>
+      </w:r>
+      <w:r>
+        <w:rPr>
+          <w:rFonts w:ascii="Calibri" w:hAnsi="Calibri" w:cs="Calibri"/>
+          <w:b/>
+        </w:rPr>
+        <w:t xml:space="preserve"> </w:t>
+      </w:r>
+      <w:r>
+        <w:rPr>
+          <w:rFonts w:ascii="Calibri" w:hAnsi="Calibri" w:cs="Calibri"/>
+        </w:rPr>
+        <w:t>Oct</w:t>
+      </w:r>
+      <w:r>
+        <w:rPr>
+          <w:rFonts w:ascii="Calibri" w:hAnsi="Calibri" w:cs="Calibri"/>
+        </w:rPr>
+        <w:t xml:space="preserve"> </w:t>
+      </w:r>
+      <w:r>
+        <w:rPr>
+          <w:rFonts w:ascii="Calibri" w:hAnsi="Calibri" w:cs="Calibri"/>
+        </w:rPr>
+        <w:t>20</w:t>
+      </w:r>
+      <w:r>
+        <w:rPr>
+          <w:rFonts w:ascii="Calibri" w:hAnsi="Calibri" w:cs="Calibri"/>
+          <w:spacing w:val="-6"/>
+        </w:rPr>
+        <w:t>24</w:t>
+      </w:r>
+      <w:r>
+        <w:rPr>
+          <w:rFonts w:ascii="Calibri" w:hAnsi="Calibri" w:cs="Calibri"/>
+        </w:rPr>
+        <w:t xml:space="preserve">– </w:t>
+      </w:r>
+      <w:r>
+        <w:rPr>
+          <w:rFonts w:ascii="Calibri" w:hAnsi="Calibri" w:cs="Calibri"/>
+        </w:rPr>
+        <w:t>Nov</w:t>
+      </w:r>
+      <w:r>
+        <w:rPr>
+          <w:rFonts w:ascii="Calibri" w:hAnsi="Calibri" w:cs="Calibri"/>
+          <w:spacing w:val="-18"/>
+        </w:rPr>
+        <w:t xml:space="preserve"> </w:t>
+      </w:r>
+      <w:r>
+        <w:rPr>
+          <w:rFonts w:ascii="Calibri" w:hAnsi="Calibri" w:cs="Calibri"/>
+          <w:spacing w:val="-18"/>
+        </w:rPr>
+        <w:t>20</w:t>
+      </w:r>
+      <w:r>
+        <w:rPr>
+          <w:rFonts w:ascii="Calibri" w:hAnsi="Calibri" w:cs="Calibri"/>
+          <w:spacing w:val="-6"/>
+        </w:rPr>
+        <w:t>24</w:t>
+      </w:r>
+    </w:p>
+    <w:p>
+      <w:pPr>
+        <w:pStyle w:val="ListParagraph"/>
+        <w:numPr>
+          <w:ilvl w:val="0"/>
+          <w:numId w:val="1"/>
+        </w:numPr>
+        <w:tabs>
+          <w:tab w:val="left" w:pos="840"/>
+          <w:tab w:val="left" w:pos="841"/>
+        </w:tabs>
+        <w:spacing w:line="240" w:lineRule="exact"/>
+        <w:ind w:left="840" w:hanging="361"/>
+        <w:rPr>
+          <w:rFonts w:ascii="Calibri" w:hAnsi="Calibri" w:cs="Calibri"/>
+        </w:rPr>
+      </w:pPr>
+      <w:r>
+        <w:rPr>
+          <w:rFonts w:ascii="Calibri" w:hAnsi="Calibri" w:cs="Calibri"/>
+        </w:rPr>
+        <w:t>Designed and developed backend logic using Java (Spring Boot) in a monolithic REST API</w:t>
+      </w:r>
+    </w:p>
+    <w:p>
+      <w:pPr>
+        <w:pStyle w:val="ListParagraph"/>
+        <w:numPr>
+          <w:ilvl w:val="0"/>
+          <w:numId w:val="1"/>
+        </w:numPr>
+        <w:tabs>
+          <w:tab w:val="left" w:pos="840"/>
+          <w:tab w:val="left" w:pos="841"/>
+        </w:tabs>
+        <w:spacing w:line="240" w:lineRule="exact"/>
+        <w:ind w:left="840" w:right="1064"/>
+        <w:rPr>
+          <w:rFonts w:ascii="Calibri" w:hAnsi="Calibri" w:cs="Calibri"/>
+        </w:rPr>
+      </w:pPr>
+      <w:r>
+        <w:rPr>
+          <w:rFonts w:ascii="Calibri" w:hAnsi="Calibri" w:cs="Calibri"/>
+        </w:rPr>
+        <w:t>Implemented dynamic map integration with Google Maps API to display registered charity institutions</w:t>
+      </w:r>
+    </w:p>
+    <w:p>
+      <w:pPr>
+        <w:pStyle w:val="ListParagraph"/>
+        <w:numPr>
+          <w:ilvl w:val="0"/>
+          <w:numId w:val="1"/>
+        </w:numPr>
+        <w:tabs>
+          <w:tab w:val="left" w:pos="840"/>
+          <w:tab w:val="left" w:pos="841"/>
+        </w:tabs>
+        <w:spacing w:line="240" w:lineRule="exact"/>
+        <w:ind w:left="840" w:right="1064"/>
+        <w:rPr>
+          <w:rFonts w:ascii="Calibri" w:hAnsi="Calibri" w:cs="Calibri"/>
+        </w:rPr>
+      </w:pPr>
+      <w:r>
+        <w:rPr>
+          <w:rFonts w:ascii="Calibri" w:hAnsi="Calibri" w:cs="Calibri"/>
+        </w:rPr>
+        <w:t>Developed donation flow with item selection and QR code generation for validation</w:t>
+      </w:r>
+    </w:p>
+    <w:p>
+      <w:pPr>
+        <w:pStyle w:val="ListParagraph"/>
+        <w:numPr>
+          <w:ilvl w:val="0"/>
+          <w:numId w:val="1"/>
+        </w:numPr>
+        <w:tabs>
+          <w:tab w:val="left" w:pos="840"/>
+          <w:tab w:val="left" w:pos="841"/>
+        </w:tabs>
+        <w:spacing w:line="240" w:lineRule="exact"/>
+        <w:ind w:left="840" w:right="1064"/>
+        <w:rPr>
+          <w:rFonts w:ascii="Calibri" w:hAnsi="Calibri" w:cs="Calibri"/>
+        </w:rPr>
+      </w:pPr>
+      <w:r>
+        <w:rPr>
+          <w:rFonts w:ascii="Calibri" w:hAnsi="Calibri" w:cs="Calibri"/>
+        </w:rPr>
+        <w:t xml:space="preserve">Built frontend interface using HTML, CSS, and </w:t>
+      </w:r>
+      <w:r>
+        <w:rPr>
+          <w:rFonts w:ascii="Calibri" w:hAnsi="Calibri" w:cs="Calibri"/>
+        </w:rPr>
+        <w:t>JavaScript</w:t>
+      </w:r>
+    </w:p>
+    <w:p>
+      <w:pPr>
+        <w:pStyle w:val="ListParagraph"/>
+        <w:numPr>
+          <w:ilvl w:val="0"/>
+          <w:numId w:val="1"/>
+        </w:numPr>
+        <w:tabs>
+          <w:tab w:val="left" w:pos="840"/>
+          <w:tab w:val="left" w:pos="841"/>
+        </w:tabs>
+        <w:spacing w:line="240" w:lineRule="exact"/>
+        <w:ind w:left="840" w:right="1064"/>
+        <w:rPr>
+          <w:rFonts w:ascii="Calibri" w:hAnsi="Calibri" w:cs="Calibri"/>
+        </w:rPr>
+      </w:pPr>
+      <w:r>
+        <w:rPr>
+          <w:rFonts w:ascii="Calibri" w:hAnsi="Calibri" w:cs="Calibri"/>
+        </w:rPr>
+        <w:t>Integrated token-based authentication with JWT for secure user sessions</w:t>
+      </w:r>
+    </w:p>
+    <w:p>
+      <w:pPr>
+        <w:pStyle w:val="ListParagraph"/>
+        <w:numPr>
+          <w:ilvl w:val="0"/>
+          <w:numId w:val="1"/>
+        </w:numPr>
+        <w:tabs>
+          <w:tab w:val="left" w:pos="840"/>
+          <w:tab w:val="left" w:pos="841"/>
+        </w:tabs>
+        <w:spacing w:line="240" w:lineRule="exact"/>
+        <w:ind w:left="840" w:right="1064"/>
+        <w:rPr>
+          <w:rFonts w:ascii="Calibri" w:hAnsi="Calibri" w:cs="Calibri"/>
+        </w:rPr>
+      </w:pPr>
+      <w:r>
+        <w:rPr>
+          <w:rFonts w:ascii="Calibri" w:hAnsi="Calibri" w:cs="Calibri"/>
+        </w:rPr>
         <w:t>Enabled donation-to-rewards system granting loyalty points (OXXO) to users after validated donations</w:t>
       </w:r>
-    </w:p>
-    <w:p>
-      <w:pPr>
-        <w:pStyle w:val="BodyText"/>
-        <w:spacing w:before="0"/>
-        <w:rPr>
-          <w:rFonts w:ascii="Calibri" w:hAnsi="Calibri" w:cs="Calibri"/>
-          <w:sz w:val="24"/>
-        </w:rPr>
-      </w:pPr>
-    </w:p>
-    <w:p>
-      <w:pPr>
-        <w:pStyle w:val="BodyText"/>
-        <w:spacing w:before="8"/>
-        <w:rPr>
-          <w:rFonts w:ascii="Calibri" w:hAnsi="Calibri" w:cs="Calibri"/>
-          <w:sz w:val="21"/>
-        </w:rPr>
-      </w:pPr>
     </w:p>
     <w:p>
       <w:pPr>

</xml_diff>

<commit_message>
Elimine seccion Academic Projects y agregue mi experiencia como Tech Lead
</commit_message>
<xml_diff>
--- a/Francisco Segura CV.docx
+++ b/Francisco Segura CV.docx
@@ -465,7 +465,7 @@
           <w:tab w:val="left" w:pos="839"/>
           <w:tab w:val="left" w:pos="840"/>
         </w:tabs>
-        <w:spacing w:line="240" w:lineRule="exact"/>
+        <w:spacing w:line="249" w:lineRule="exact"/>
         <w:ind w:right="482"/>
         <w:rPr>
           <w:rFonts w:ascii="Calibri" w:hAnsi="Calibri" w:cs="Calibri"/>
@@ -489,7 +489,7 @@
           <w:tab w:val="left" w:pos="839"/>
           <w:tab w:val="left" w:pos="840"/>
         </w:tabs>
-        <w:spacing w:line="240" w:lineRule="exact"/>
+        <w:spacing w:line="249" w:lineRule="exact"/>
         <w:ind w:right="482"/>
         <w:rPr>
           <w:rFonts w:ascii="Calibri" w:hAnsi="Calibri" w:cs="Calibri"/>
@@ -513,7 +513,7 @@
           <w:tab w:val="left" w:pos="839"/>
           <w:tab w:val="left" w:pos="840"/>
         </w:tabs>
-        <w:spacing w:line="240" w:lineRule="exact"/>
+        <w:spacing w:line="249" w:lineRule="exact"/>
         <w:ind w:right="482"/>
         <w:rPr>
           <w:rFonts w:ascii="Calibri" w:hAnsi="Calibri" w:cs="Calibri"/>
@@ -537,7 +537,7 @@
           <w:tab w:val="left" w:pos="839"/>
           <w:tab w:val="left" w:pos="840"/>
         </w:tabs>
-        <w:spacing w:line="240" w:lineRule="exact"/>
+        <w:spacing w:line="249" w:lineRule="exact"/>
         <w:ind w:right="482"/>
         <w:rPr>
           <w:rFonts w:ascii="Calibri" w:hAnsi="Calibri" w:cs="Calibri"/>
@@ -561,7 +561,7 @@
           <w:tab w:val="left" w:pos="839"/>
           <w:tab w:val="left" w:pos="840"/>
         </w:tabs>
-        <w:spacing w:line="240" w:lineRule="exact"/>
+        <w:spacing w:line="249" w:lineRule="exact"/>
         <w:ind w:right="482"/>
         <w:rPr>
           <w:rFonts w:ascii="Calibri" w:hAnsi="Calibri" w:cs="Calibri"/>
@@ -585,7 +585,7 @@
           <w:tab w:val="left" w:pos="839"/>
           <w:tab w:val="left" w:pos="840"/>
         </w:tabs>
-        <w:spacing w:line="240" w:lineRule="exact"/>
+        <w:spacing w:line="249" w:lineRule="exact"/>
         <w:ind w:right="482"/>
         <w:rPr>
           <w:rFonts w:ascii="Calibri" w:hAnsi="Calibri" w:cs="Calibri"/>
@@ -646,7 +646,7 @@
           <w:rFonts w:ascii="Calibri" w:hAnsi="Calibri" w:cs="Calibri"/>
           <w:b/>
         </w:rPr>
-        <w:t>Internship</w:t>
+        <w:t>Tech Lead</w:t>
       </w:r>
       <w:r>
         <w:rPr>
@@ -659,38 +659,7 @@
         <w:rPr>
           <w:rFonts w:ascii="Calibri" w:hAnsi="Calibri" w:cs="Calibri"/>
         </w:rPr>
-        <w:t xml:space="preserve">Sept </w:t>
-      </w:r>
-      <w:r>
-        <w:rPr>
-          <w:rFonts w:ascii="Calibri" w:hAnsi="Calibri" w:cs="Calibri"/>
-        </w:rPr>
-        <w:t>20</w:t>
-      </w:r>
-      <w:r>
-        <w:rPr>
-          <w:rFonts w:ascii="Calibri" w:hAnsi="Calibri" w:cs="Calibri"/>
-        </w:rPr>
-        <w:t>25</w:t>
-      </w:r>
-      <w:r>
-        <w:rPr>
-          <w:rFonts w:ascii="Calibri" w:hAnsi="Calibri" w:cs="Calibri"/>
-          <w:spacing w:val="-6"/>
-        </w:rPr>
-        <w:t xml:space="preserve"> </w:t>
-      </w:r>
-      <w:r>
-        <w:rPr>
-          <w:rFonts w:ascii="Calibri" w:hAnsi="Calibri" w:cs="Calibri"/>
-        </w:rPr>
-        <w:t xml:space="preserve">– </w:t>
-      </w:r>
-      <w:r>
-        <w:rPr>
-          <w:rFonts w:ascii="Calibri" w:hAnsi="Calibri" w:cs="Calibri"/>
-        </w:rPr>
-        <w:t>Present</w:t>
+        <w:t>Sept 2026 – Present</w:t>
       </w:r>
     </w:p>
     <w:p>
@@ -704,7 +673,7 @@
           <w:tab w:val="left" w:pos="839"/>
           <w:tab w:val="left" w:pos="840"/>
         </w:tabs>
-        <w:spacing w:line="240" w:lineRule="exact"/>
+        <w:spacing w:line="249" w:lineRule="exact"/>
         <w:ind w:right="482"/>
         <w:rPr>
           <w:rFonts w:ascii="Calibri" w:hAnsi="Calibri" w:cs="Calibri"/>
@@ -714,7 +683,7 @@
         <w:rPr>
           <w:rFonts w:ascii="Calibri" w:hAnsi="Calibri" w:cs="Calibri"/>
         </w:rPr>
-        <w:t>Gathering and definition of system requirements for project scope</w:t>
+        <w:t>Cross-Functional Team Leadership: Direct and mentor 3 teams of student engineers and designers, driving Agile sprint planning, technical spikes, GitHub issue management, and peer code reviews.</w:t>
       </w:r>
     </w:p>
     <w:p>
@@ -728,16 +697,17 @@
           <w:tab w:val="left" w:pos="839"/>
           <w:tab w:val="left" w:pos="840"/>
         </w:tabs>
-        <w:spacing w:line="240" w:lineRule="exact"/>
-        <w:rPr>
-          <w:rFonts w:ascii="Calibri" w:hAnsi="Calibri" w:cs="Calibri"/>
-        </w:rPr>
-      </w:pPr>
-      <w:r>
-        <w:rPr>
-          <w:rFonts w:ascii="Calibri" w:hAnsi="Calibri" w:cs="Calibri"/>
-        </w:rPr>
-        <w:t>Design of user interface views with React and backend architecture with Spring Boot</w:t>
+        <w:spacing w:line="249" w:lineRule="exact"/>
+        <w:ind w:right="482"/>
+        <w:rPr>
+          <w:rFonts w:ascii="Calibri" w:hAnsi="Calibri" w:cs="Calibri"/>
+        </w:rPr>
+      </w:pPr>
+      <w:r>
+        <w:rPr>
+          <w:rFonts w:ascii="Calibri" w:hAnsi="Calibri" w:cs="Calibri"/>
+        </w:rPr>
+        <w:t>Academic Evidence System (V1 to V2 Evolution): Co-led a peer development team to architect and launch V1; currently manage the support pipeline while steering the system architecture, API redesign, and feature roadmap for Version 2.</w:t>
       </w:r>
     </w:p>
     <w:p>
@@ -751,16 +721,17 @@
           <w:tab w:val="left" w:pos="839"/>
           <w:tab w:val="left" w:pos="840"/>
         </w:tabs>
-        <w:spacing w:line="240" w:lineRule="exact"/>
-        <w:rPr>
-          <w:rFonts w:ascii="Calibri" w:hAnsi="Calibri" w:cs="Calibri"/>
-        </w:rPr>
-      </w:pPr>
-      <w:r>
-        <w:rPr>
-          <w:rFonts w:ascii="Calibri" w:hAnsi="Calibri" w:cs="Calibri"/>
-        </w:rPr>
-        <w:t>Development and implementation of frontend components using React and Tailwind</w:t>
+        <w:spacing w:line="249" w:lineRule="exact"/>
+        <w:ind w:right="482"/>
+        <w:rPr>
+          <w:rFonts w:ascii="Calibri" w:hAnsi="Calibri" w:cs="Calibri"/>
+        </w:rPr>
+      </w:pPr>
+      <w:r>
+        <w:rPr>
+          <w:rFonts w:ascii="Calibri" w:hAnsi="Calibri" w:cs="Calibri"/>
+        </w:rPr>
+        <w:t>Becas CUT Platform (Engineering &amp; Security): Lead the development of the centralized scholarship system, driving SSO/SIIAU authentication, real-time QR-code meal validation, and automated rule engines for student eligibility.</w:t>
       </w:r>
     </w:p>
     <w:p>
@@ -774,22 +745,17 @@
           <w:tab w:val="left" w:pos="839"/>
           <w:tab w:val="left" w:pos="840"/>
         </w:tabs>
-        <w:spacing w:line="240" w:lineRule="exact"/>
-        <w:rPr>
-          <w:rFonts w:ascii="Calibri" w:hAnsi="Calibri" w:cs="Calibri"/>
-        </w:rPr>
-      </w:pPr>
-      <w:r>
-        <w:rPr>
-          <w:rFonts w:ascii="Calibri" w:hAnsi="Calibri" w:cs="Calibri"/>
-        </w:rPr>
-        <w:t xml:space="preserve">Development and integration of backend services using </w:t>
-      </w:r>
-      <w:r>
-        <w:rPr>
-          <w:rFonts w:ascii="Calibri" w:hAnsi="Calibri" w:cs="Calibri"/>
-        </w:rPr>
-        <w:t>Java (Spring Boot)</w:t>
+        <w:spacing w:line="249" w:lineRule="exact"/>
+        <w:ind w:right="482"/>
+        <w:rPr>
+          <w:rFonts w:ascii="Calibri" w:hAnsi="Calibri" w:cs="Calibri"/>
+        </w:rPr>
+      </w:pPr>
+      <w:r>
+        <w:rPr>
+          <w:rFonts w:ascii="Calibri" w:hAnsi="Calibri" w:cs="Calibri"/>
+        </w:rPr>
+        <w:t>Institutional Design System Initiative: Founded a dedicated UI/UX team to build the university's official digital brand guidelines, translating design theory into reusable component libraries and visual tokens across campus apps.</w:t>
       </w:r>
     </w:p>
     <w:p>
@@ -803,16 +769,81 @@
           <w:tab w:val="left" w:pos="839"/>
           <w:tab w:val="left" w:pos="840"/>
         </w:tabs>
-        <w:spacing w:line="240" w:lineRule="exact"/>
-        <w:rPr>
-          <w:rFonts w:ascii="Calibri" w:hAnsi="Calibri" w:cs="Calibri"/>
-        </w:rPr>
-      </w:pPr>
-      <w:r>
-        <w:rPr>
-          <w:rFonts w:ascii="Calibri" w:hAnsi="Calibri" w:cs="Calibri"/>
-        </w:rPr>
-        <w:t>Implementations of an additional microservice with Node.js (Express)</w:t>
+        <w:spacing w:line="249" w:lineRule="exact"/>
+        <w:ind w:right="482"/>
+        <w:rPr>
+          <w:rFonts w:ascii="Calibri" w:hAnsi="Calibri" w:cs="Calibri"/>
+        </w:rPr>
+      </w:pPr>
+      <w:r>
+        <w:rPr>
+          <w:rFonts w:ascii="Calibri" w:hAnsi="Calibri" w:cs="Calibri"/>
+        </w:rPr>
+        <w:t>Technical Governance &amp; Quality: Standardize REST API contracts, database schemas, and Git branching strategies to enforce clean code architecture and streamline developer onboarding across all active projects.</w:t>
+      </w:r>
+    </w:p>
+    <w:p>
+      <w:pPr>
+        <w:tabs>
+          <w:tab w:val="left" w:pos="9885"/>
+        </w:tabs>
+        <w:spacing w:before="11"/>
+        <w:jc w:val="center"/>
+        <w:rPr>
+          <w:rFonts w:ascii="Calibri" w:hAnsi="Calibri" w:cs="Calibri"/>
+        </w:rPr>
+      </w:pPr>
+      <w:r>
+        <w:rPr>
+          <w:rFonts w:ascii="Calibri" w:hAnsi="Calibri" w:cs="Calibri"/>
+          <w:b/>
+        </w:rPr>
+        <w:t xml:space="preserve">Universidad de Guadalajara</w:t>
+      </w:r>
+      <w:r>
+        <w:rPr>
+          <w:rFonts w:ascii="Calibri" w:hAnsi="Calibri" w:cs="Calibri"/>
+          <w:b/>
+        </w:rPr>
+        <w:tab/>
+      </w:r>
+      <w:r>
+        <w:rPr>
+          <w:rFonts w:ascii="Calibri" w:hAnsi="Calibri" w:cs="Calibri"/>
+        </w:rPr>
+        <w:t xml:space="preserve">Remote</w:t>
+      </w:r>
+    </w:p>
+    <w:p>
+      <w:pPr>
+        <w:tabs>
+          <w:tab w:val="left" w:pos="8621"/>
+        </w:tabs>
+        <w:spacing w:before="11" w:line="251" w:lineRule="exact"/>
+        <w:ind w:left="174"/>
+        <w:rPr>
+          <w:rFonts w:ascii="Calibri" w:hAnsi="Calibri" w:cs="Calibri"/>
+        </w:rPr>
+      </w:pPr>
+      <w:r>
+        <w:rPr>
+          <w:rFonts w:ascii="Calibri" w:hAnsi="Calibri" w:cs="Calibri"/>
+          <w:b/>
+        </w:rPr>
+        <w:t>Internship</w:t>
+      </w:r>
+      <w:r>
+        <w:rPr>
+          <w:rFonts w:ascii="Calibri" w:hAnsi="Calibri" w:cs="Calibri"/>
+          <w:b/>
+        </w:rPr>
+        <w:tab/>
+      </w:r>
+      <w:r>
+        <w:rPr>
+          <w:rFonts w:ascii="Calibri" w:hAnsi="Calibri" w:cs="Calibri"/>
+        </w:rPr>
+        <w:t>Sept 2025 – Jun 2026</w:t>
       </w:r>
     </w:p>
     <w:p>
@@ -826,185 +857,17 @@
           <w:tab w:val="left" w:pos="839"/>
           <w:tab w:val="left" w:pos="840"/>
         </w:tabs>
-        <w:spacing w:line="240" w:lineRule="exact"/>
-        <w:rPr>
-          <w:rFonts w:ascii="Calibri" w:hAnsi="Calibri" w:cs="Calibri"/>
-        </w:rPr>
-      </w:pPr>
-      <w:r>
-        <w:rPr>
-          <w:rFonts w:ascii="Calibri" w:hAnsi="Calibri" w:cs="Calibri"/>
-        </w:rPr>
-        <w:t>Collaboration in ensuring consistency between design, functionality, and microservices integration</w:t>
-      </w:r>
-    </w:p>
-    <w:p>
-      <w:pPr>
-        <w:pStyle w:val="ListParagraph"/>
-        <w:tabs>
-          <w:tab w:val="left" w:pos="839"/>
-          <w:tab w:val="left" w:pos="840"/>
-        </w:tabs>
-        <w:spacing w:line="240" w:lineRule="exact"/>
-        <w:ind w:left="479" w:firstLine="0"/>
-        <w:rPr>
-          <w:rFonts w:ascii="Calibri" w:hAnsi="Calibri" w:cs="Calibri"/>
-        </w:rPr>
-      </w:pPr>
-    </w:p>
-    <w:p>
-      <w:pPr>
-        <w:pStyle w:val="Heading1"/>
-        <w:spacing w:before="1"/>
-        <w:jc w:val="center"/>
-        <w:rPr>
-          <w:rFonts w:ascii="Calibri" w:hAnsi="Calibri" w:cs="Calibri"/>
-        </w:rPr>
-      </w:pPr>
-      <w:r>
-        <w:rPr>
-          <w:rFonts w:ascii="Calibri" w:hAnsi="Calibri" w:cs="Calibri"/>
-        </w:rPr>
-        <w:t>Academic Projects</w:t>
-      </w:r>
-    </w:p>
-    <w:p>
-      <w:pPr>
-        <w:tabs>
-          <w:tab w:val="left" w:pos="9885"/>
-        </w:tabs>
-        <w:spacing w:before="11"/>
-        <w:jc w:val="center"/>
-        <w:rPr>
-          <w:rFonts w:ascii="Calibri" w:hAnsi="Calibri" w:cs="Calibri"/>
-        </w:rPr>
-      </w:pPr>
-      <w:r>
-        <w:rPr>
-          <w:rFonts w:ascii="Calibri" w:hAnsi="Calibri" w:cs="Calibri"/>
-          <w:b/>
-        </w:rPr>
-        <w:t>Ticketmeister</w:t>
-      </w:r>
-      <w:r>
-        <w:rPr>
-          <w:rFonts w:ascii="Calibri" w:hAnsi="Calibri" w:cs="Calibri"/>
-          <w:b/>
-        </w:rPr>
-        <w:tab/>
-      </w:r>
-      <w:r>
-        <w:rPr>
-          <w:rFonts w:ascii="Calibri" w:hAnsi="Calibri" w:cs="Calibri"/>
-          <w:spacing w:val="-3"/>
-        </w:rPr>
-        <w:t>Remote</w:t>
-      </w:r>
-    </w:p>
-    <w:p>
-      <w:pPr>
-        <w:pStyle w:val="BodyText"/>
-        <w:tabs>
-          <w:tab w:val="left" w:pos="8622"/>
-        </w:tabs>
-        <w:spacing w:line="251" w:lineRule="exact"/>
-        <w:ind w:left="120"/>
-        <w:rPr>
-          <w:rFonts w:ascii="Calibri" w:hAnsi="Calibri" w:cs="Calibri"/>
-        </w:rPr>
-      </w:pPr>
-      <w:r>
-        <w:rPr>
-          <w:rFonts w:ascii="Calibri" w:hAnsi="Calibri" w:cs="Calibri"/>
-          <w:b/>
-        </w:rPr>
-        <w:t>Full-stack developer</w:t>
-      </w:r>
-      <w:r>
-        <w:rPr>
-          <w:rFonts w:ascii="Calibri" w:hAnsi="Calibri" w:cs="Calibri"/>
-          <w:b/>
-        </w:rPr>
-        <w:tab/>
-      </w:r>
-      <w:r>
-        <w:rPr>
-          <w:rFonts w:ascii="Calibri" w:hAnsi="Calibri" w:cs="Calibri"/>
-          <w:b/>
-        </w:rPr>
-        <w:t xml:space="preserve"> </w:t>
-      </w:r>
-      <w:r>
-        <w:rPr>
-          <w:rFonts w:ascii="Calibri" w:hAnsi="Calibri" w:cs="Calibri"/>
-        </w:rPr>
-        <w:t>Feb</w:t>
-      </w:r>
-      <w:r>
-        <w:rPr>
-          <w:rFonts w:ascii="Calibri" w:hAnsi="Calibri" w:cs="Calibri"/>
-        </w:rPr>
-        <w:t xml:space="preserve"> </w:t>
-      </w:r>
-      <w:r>
-        <w:rPr>
-          <w:rFonts w:ascii="Calibri" w:hAnsi="Calibri" w:cs="Calibri"/>
-        </w:rPr>
-        <w:t>20</w:t>
-      </w:r>
-      <w:r>
-        <w:rPr>
-          <w:rFonts w:ascii="Calibri" w:hAnsi="Calibri" w:cs="Calibri"/>
-          <w:spacing w:val="-6"/>
-        </w:rPr>
-        <w:t>2</w:t>
-      </w:r>
-      <w:r>
-        <w:rPr>
-          <w:rFonts w:ascii="Calibri" w:hAnsi="Calibri" w:cs="Calibri"/>
-          <w:spacing w:val="-6"/>
-        </w:rPr>
-        <w:t xml:space="preserve">5 </w:t>
-      </w:r>
-      <w:r>
-        <w:rPr>
-          <w:rFonts w:ascii="Calibri" w:hAnsi="Calibri" w:cs="Calibri"/>
-        </w:rPr>
-        <w:t xml:space="preserve">– </w:t>
-      </w:r>
-      <w:r>
-        <w:rPr>
-          <w:rFonts w:ascii="Calibri" w:hAnsi="Calibri" w:cs="Calibri"/>
-        </w:rPr>
-        <w:t>Mar</w:t>
-      </w:r>
-      <w:r>
-        <w:rPr>
-          <w:rFonts w:ascii="Calibri" w:hAnsi="Calibri" w:cs="Calibri"/>
-          <w:spacing w:val="-18"/>
-        </w:rPr>
-        <w:t xml:space="preserve"> </w:t>
-      </w:r>
-      <w:r>
-        <w:rPr>
-          <w:rFonts w:ascii="Calibri" w:hAnsi="Calibri" w:cs="Calibri"/>
-          <w:spacing w:val="-18"/>
-        </w:rPr>
-        <w:t>20</w:t>
-      </w:r>
-      <w:r>
-        <w:rPr>
-          <w:rFonts w:ascii="Calibri" w:hAnsi="Calibri" w:cs="Calibri"/>
-          <w:spacing w:val="-6"/>
-        </w:rPr>
-        <w:t>2</w:t>
-      </w:r>
-      <w:r>
-        <w:rPr>
-          <w:rFonts w:ascii="Calibri" w:hAnsi="Calibri" w:cs="Calibri"/>
-          <w:spacing w:val="-6"/>
-        </w:rPr>
-        <w:t>5</w:t>
+        <w:spacing w:line="249" w:lineRule="exact"/>
+        <w:ind w:right="482"/>
+        <w:rPr>
+          <w:rFonts w:ascii="Calibri" w:hAnsi="Calibri" w:cs="Calibri"/>
+        </w:rPr>
+      </w:pPr>
+      <w:r>
+        <w:rPr>
+          <w:rFonts w:ascii="Calibri" w:hAnsi="Calibri" w:cs="Calibri"/>
+        </w:rPr>
+        <w:t>Gathering and definition of system requirements for project scope</w:t>
       </w:r>
     </w:p>
     <w:p>
@@ -1015,20 +878,19 @@
           <w:numId w:val="1"/>
         </w:numPr>
         <w:tabs>
+          <w:tab w:val="left" w:pos="839"/>
           <w:tab w:val="left" w:pos="840"/>
-          <w:tab w:val="left" w:pos="841"/>
         </w:tabs>
-        <w:spacing w:line="240" w:lineRule="exact"/>
-        <w:ind w:left="840" w:hanging="361"/>
-        <w:rPr>
-          <w:rFonts w:ascii="Calibri" w:hAnsi="Calibri" w:cs="Calibri"/>
-        </w:rPr>
-      </w:pPr>
-      <w:r>
-        <w:rPr>
-          <w:rFonts w:ascii="Calibri" w:hAnsi="Calibri" w:cs="Calibri"/>
-        </w:rPr>
-        <w:t>Developed microservices-based architecture with Python (Flask) for authentication and event management</w:t>
+        <w:spacing w:line="249" w:lineRule="exact"/>
+        <w:rPr>
+          <w:rFonts w:ascii="Calibri" w:hAnsi="Calibri" w:cs="Calibri"/>
+        </w:rPr>
+      </w:pPr>
+      <w:r>
+        <w:rPr>
+          <w:rFonts w:ascii="Calibri" w:hAnsi="Calibri" w:cs="Calibri"/>
+        </w:rPr>
+        <w:t>Design of user interface views with React and backend architecture with Spring Boot</w:t>
       </w:r>
     </w:p>
     <w:p>
@@ -1039,20 +901,19 @@
           <w:numId w:val="1"/>
         </w:numPr>
         <w:tabs>
+          <w:tab w:val="left" w:pos="839"/>
           <w:tab w:val="left" w:pos="840"/>
-          <w:tab w:val="left" w:pos="841"/>
         </w:tabs>
-        <w:spacing w:line="240" w:lineRule="exact"/>
-        <w:ind w:left="840" w:right="1064"/>
-        <w:rPr>
-          <w:rFonts w:ascii="Calibri" w:hAnsi="Calibri" w:cs="Calibri"/>
-        </w:rPr>
-      </w:pPr>
-      <w:r>
-        <w:rPr>
-          <w:rFonts w:ascii="Calibri" w:hAnsi="Calibri" w:cs="Calibri"/>
-        </w:rPr>
-        <w:t>Implemented Node.js (Express) service for automated email delivery of purchased tickets</w:t>
+        <w:spacing w:line="249" w:lineRule="exact"/>
+        <w:rPr>
+          <w:rFonts w:ascii="Calibri" w:hAnsi="Calibri" w:cs="Calibri"/>
+        </w:rPr>
+      </w:pPr>
+      <w:r>
+        <w:rPr>
+          <w:rFonts w:ascii="Calibri" w:hAnsi="Calibri" w:cs="Calibri"/>
+        </w:rPr>
+        <w:t>Development and implementation of frontend components using React and Tailwind</w:t>
       </w:r>
     </w:p>
     <w:p>
@@ -1063,20 +924,25 @@
           <w:numId w:val="1"/>
         </w:numPr>
         <w:tabs>
+          <w:tab w:val="left" w:pos="839"/>
           <w:tab w:val="left" w:pos="840"/>
-          <w:tab w:val="left" w:pos="841"/>
         </w:tabs>
-        <w:spacing w:line="240" w:lineRule="exact"/>
-        <w:ind w:left="840" w:right="1064"/>
-        <w:rPr>
-          <w:rFonts w:ascii="Calibri" w:hAnsi="Calibri" w:cs="Calibri"/>
-        </w:rPr>
-      </w:pPr>
-      <w:r>
-        <w:rPr>
-          <w:rFonts w:ascii="Calibri" w:hAnsi="Calibri" w:cs="Calibri"/>
-        </w:rPr>
-        <w:t>Built frontend application with Angular for browsing and purchasing event tickets</w:t>
+        <w:spacing w:line="249" w:lineRule="exact"/>
+        <w:rPr>
+          <w:rFonts w:ascii="Calibri" w:hAnsi="Calibri" w:cs="Calibri"/>
+        </w:rPr>
+      </w:pPr>
+      <w:r>
+        <w:rPr>
+          <w:rFonts w:ascii="Calibri" w:hAnsi="Calibri" w:cs="Calibri"/>
+        </w:rPr>
+        <w:t xml:space="preserve">Development and integration of backend services using </w:t>
+      </w:r>
+      <w:r>
+        <w:rPr>
+          <w:rFonts w:ascii="Calibri" w:hAnsi="Calibri" w:cs="Calibri"/>
+        </w:rPr>
+        <w:t>Java (Spring Boot)</w:t>
       </w:r>
     </w:p>
     <w:p>
@@ -1087,20 +953,19 @@
           <w:numId w:val="1"/>
         </w:numPr>
         <w:tabs>
+          <w:tab w:val="left" w:pos="839"/>
           <w:tab w:val="left" w:pos="840"/>
-          <w:tab w:val="left" w:pos="841"/>
         </w:tabs>
-        <w:spacing w:line="240" w:lineRule="exact"/>
-        <w:ind w:left="840" w:right="1064"/>
-        <w:rPr>
-          <w:rFonts w:ascii="Calibri" w:hAnsi="Calibri" w:cs="Calibri"/>
-        </w:rPr>
-      </w:pPr>
-      <w:r>
-        <w:rPr>
-          <w:rFonts w:ascii="Calibri" w:hAnsi="Calibri" w:cs="Calibri"/>
-        </w:rPr>
-        <w:t>Integrated OpenStreetMap API to display event locations on an interactive map</w:t>
+        <w:spacing w:line="249" w:lineRule="exact"/>
+        <w:rPr>
+          <w:rFonts w:ascii="Calibri" w:hAnsi="Calibri" w:cs="Calibri"/>
+        </w:rPr>
+      </w:pPr>
+      <w:r>
+        <w:rPr>
+          <w:rFonts w:ascii="Calibri" w:hAnsi="Calibri" w:cs="Calibri"/>
+        </w:rPr>
+        <w:t>Implementations of an additional microservice with Node.js (Express)</w:t>
       </w:r>
     </w:p>
     <w:p>
@@ -1111,312 +976,42 @@
           <w:numId w:val="1"/>
         </w:numPr>
         <w:tabs>
+          <w:tab w:val="left" w:pos="839"/>
           <w:tab w:val="left" w:pos="840"/>
-          <w:tab w:val="left" w:pos="841"/>
         </w:tabs>
-        <w:spacing w:line="240" w:lineRule="exact"/>
-        <w:ind w:left="840" w:right="1064"/>
-        <w:rPr>
-          <w:rFonts w:ascii="Calibri" w:hAnsi="Calibri" w:cs="Calibri"/>
-        </w:rPr>
-      </w:pPr>
-      <w:r>
-        <w:rPr>
-          <w:rFonts w:ascii="Calibri" w:hAnsi="Calibri" w:cs="Calibri"/>
-        </w:rPr>
-        <w:t xml:space="preserve">Designed </w:t>
-      </w:r>
-      <w:r>
-        <w:rPr>
-          <w:rFonts w:ascii="Calibri" w:hAnsi="Calibri" w:cs="Calibri"/>
-        </w:rPr>
-        <w:t>RESTful APIs to ensure modularity and service scalability</w:t>
-      </w:r>
-    </w:p>
-    <w:p>
-      <w:pPr>
-        <w:pStyle w:val="Heading1"/>
-        <w:spacing w:before="1"/>
-        <w:jc w:val="center"/>
-        <w:rPr>
-          <w:rFonts w:ascii="Calibri" w:hAnsi="Calibri" w:cs="Calibri"/>
-        </w:rPr>
-      </w:pPr>
-    </w:p>
-    <w:p>
-      <w:pPr>
-        <w:tabs>
-          <w:tab w:val="left" w:pos="9885"/>
-        </w:tabs>
-        <w:spacing w:before="11"/>
-        <w:jc w:val="center"/>
-        <w:rPr>
-          <w:rFonts w:ascii="Calibri" w:hAnsi="Calibri" w:cs="Calibri"/>
-        </w:rPr>
-      </w:pPr>
-      <w:r>
-        <w:rPr>
-          <w:rFonts w:ascii="Calibri" w:hAnsi="Calibri" w:cs="Calibri"/>
-          <w:b/>
-        </w:rPr>
-        <w:t>Donactiva</w:t>
-      </w:r>
-      <w:r>
-        <w:rPr>
-          <w:rFonts w:ascii="Calibri" w:hAnsi="Calibri" w:cs="Calibri"/>
-          <w:b/>
-        </w:rPr>
-        <w:tab/>
-      </w:r>
-      <w:r>
-        <w:rPr>
-          <w:rFonts w:ascii="Calibri" w:hAnsi="Calibri" w:cs="Calibri"/>
-          <w:spacing w:val="-3"/>
-        </w:rPr>
-        <w:t>Remote</w:t>
+        <w:spacing w:line="249" w:lineRule="exact"/>
+        <w:rPr>
+          <w:rFonts w:ascii="Calibri" w:hAnsi="Calibri" w:cs="Calibri"/>
+        </w:rPr>
+      </w:pPr>
+      <w:r>
+        <w:rPr>
+          <w:rFonts w:ascii="Calibri" w:hAnsi="Calibri" w:cs="Calibri"/>
+        </w:rPr>
+        <w:t>Collaboration in ensuring consistency between design, functionality, and microservices integration</w:t>
       </w:r>
     </w:p>
     <w:p>
       <w:pPr>
         <w:pStyle w:val="BodyText"/>
-        <w:tabs>
-          <w:tab w:val="left" w:pos="8622"/>
-        </w:tabs>
-        <w:spacing w:line="251" w:lineRule="exact"/>
-        <w:ind w:left="120"/>
-        <w:rPr>
-          <w:rFonts w:ascii="Calibri" w:hAnsi="Calibri" w:cs="Calibri"/>
-        </w:rPr>
-      </w:pPr>
-      <w:r>
-        <w:rPr>
-          <w:rFonts w:ascii="Calibri" w:hAnsi="Calibri" w:cs="Calibri"/>
-          <w:b/>
-        </w:rPr>
-        <w:t>Full-stack developer</w:t>
-      </w:r>
-      <w:r>
-        <w:rPr>
-          <w:rFonts w:ascii="Calibri" w:hAnsi="Calibri" w:cs="Calibri"/>
-          <w:b/>
-        </w:rPr>
-        <w:tab/>
-      </w:r>
-      <w:r>
-        <w:rPr>
-          <w:rFonts w:ascii="Calibri" w:hAnsi="Calibri" w:cs="Calibri"/>
-          <w:b/>
-        </w:rPr>
-        <w:t xml:space="preserve"> </w:t>
-      </w:r>
-      <w:r>
-        <w:rPr>
-          <w:rFonts w:ascii="Calibri" w:hAnsi="Calibri" w:cs="Calibri"/>
-        </w:rPr>
-        <w:t>Oct</w:t>
-      </w:r>
-      <w:r>
-        <w:rPr>
-          <w:rFonts w:ascii="Calibri" w:hAnsi="Calibri" w:cs="Calibri"/>
-        </w:rPr>
-        <w:t xml:space="preserve"> </w:t>
-      </w:r>
-      <w:r>
-        <w:rPr>
-          <w:rFonts w:ascii="Calibri" w:hAnsi="Calibri" w:cs="Calibri"/>
-        </w:rPr>
-        <w:t>20</w:t>
-      </w:r>
-      <w:r>
-        <w:rPr>
-          <w:rFonts w:ascii="Calibri" w:hAnsi="Calibri" w:cs="Calibri"/>
-          <w:spacing w:val="-6"/>
-        </w:rPr>
-        <w:t>24</w:t>
-      </w:r>
-      <w:r>
-        <w:rPr>
-          <w:rFonts w:ascii="Calibri" w:hAnsi="Calibri" w:cs="Calibri"/>
-        </w:rPr>
-        <w:t xml:space="preserve">– </w:t>
-      </w:r>
-      <w:r>
-        <w:rPr>
-          <w:rFonts w:ascii="Calibri" w:hAnsi="Calibri" w:cs="Calibri"/>
-        </w:rPr>
-        <w:t>Nov</w:t>
-      </w:r>
-      <w:r>
-        <w:rPr>
-          <w:rFonts w:ascii="Calibri" w:hAnsi="Calibri" w:cs="Calibri"/>
-          <w:spacing w:val="-18"/>
-        </w:rPr>
-        <w:t xml:space="preserve"> </w:t>
-      </w:r>
-      <w:r>
-        <w:rPr>
-          <w:rFonts w:ascii="Calibri" w:hAnsi="Calibri" w:cs="Calibri"/>
-          <w:spacing w:val="-18"/>
-        </w:rPr>
-        <w:t>20</w:t>
-      </w:r>
-      <w:r>
-        <w:rPr>
-          <w:rFonts w:ascii="Calibri" w:hAnsi="Calibri" w:cs="Calibri"/>
-          <w:spacing w:val="-6"/>
-        </w:rPr>
-        <w:t>24</w:t>
-      </w:r>
-    </w:p>
-    <w:p>
-      <w:pPr>
-        <w:pStyle w:val="ListParagraph"/>
-        <w:numPr>
-          <w:ilvl w:val="0"/>
-          <w:numId w:val="1"/>
-        </w:numPr>
-        <w:tabs>
-          <w:tab w:val="left" w:pos="840"/>
-          <w:tab w:val="left" w:pos="841"/>
-        </w:tabs>
-        <w:spacing w:line="240" w:lineRule="exact"/>
-        <w:ind w:left="840" w:hanging="361"/>
-        <w:rPr>
-          <w:rFonts w:ascii="Calibri" w:hAnsi="Calibri" w:cs="Calibri"/>
-        </w:rPr>
-      </w:pPr>
-      <w:r>
-        <w:rPr>
-          <w:rFonts w:ascii="Calibri" w:hAnsi="Calibri" w:cs="Calibri"/>
-        </w:rPr>
-        <w:t>Designed and developed backend logic using Java (Spring Boot) in a monolithic REST API</w:t>
-      </w:r>
-    </w:p>
-    <w:p>
-      <w:pPr>
-        <w:pStyle w:val="ListParagraph"/>
-        <w:numPr>
-          <w:ilvl w:val="0"/>
-          <w:numId w:val="1"/>
-        </w:numPr>
-        <w:tabs>
-          <w:tab w:val="left" w:pos="840"/>
-          <w:tab w:val="left" w:pos="841"/>
-        </w:tabs>
-        <w:spacing w:line="240" w:lineRule="exact"/>
-        <w:ind w:left="840" w:right="1064"/>
-        <w:rPr>
-          <w:rFonts w:ascii="Calibri" w:hAnsi="Calibri" w:cs="Calibri"/>
-        </w:rPr>
-      </w:pPr>
-      <w:r>
-        <w:rPr>
-          <w:rFonts w:ascii="Calibri" w:hAnsi="Calibri" w:cs="Calibri"/>
-        </w:rPr>
-        <w:t>Implemented dynamic map integration with Google Maps API to display registered charity institutions</w:t>
-      </w:r>
-    </w:p>
-    <w:p>
-      <w:pPr>
-        <w:pStyle w:val="ListParagraph"/>
-        <w:numPr>
-          <w:ilvl w:val="0"/>
-          <w:numId w:val="1"/>
-        </w:numPr>
-        <w:tabs>
-          <w:tab w:val="left" w:pos="840"/>
-          <w:tab w:val="left" w:pos="841"/>
-        </w:tabs>
-        <w:spacing w:line="240" w:lineRule="exact"/>
-        <w:ind w:left="840" w:right="1064"/>
-        <w:rPr>
-          <w:rFonts w:ascii="Calibri" w:hAnsi="Calibri" w:cs="Calibri"/>
-        </w:rPr>
-      </w:pPr>
-      <w:r>
-        <w:rPr>
-          <w:rFonts w:ascii="Calibri" w:hAnsi="Calibri" w:cs="Calibri"/>
-        </w:rPr>
-        <w:t>Developed donation flow with item selection and QR code generation for validation</w:t>
-      </w:r>
-    </w:p>
-    <w:p>
-      <w:pPr>
-        <w:pStyle w:val="ListParagraph"/>
-        <w:numPr>
-          <w:ilvl w:val="0"/>
-          <w:numId w:val="1"/>
-        </w:numPr>
-        <w:tabs>
-          <w:tab w:val="left" w:pos="840"/>
-          <w:tab w:val="left" w:pos="841"/>
-        </w:tabs>
-        <w:spacing w:line="240" w:lineRule="exact"/>
-        <w:ind w:left="840" w:right="1064"/>
-        <w:rPr>
-          <w:rFonts w:ascii="Calibri" w:hAnsi="Calibri" w:cs="Calibri"/>
-        </w:rPr>
-      </w:pPr>
-      <w:r>
-        <w:rPr>
-          <w:rFonts w:ascii="Calibri" w:hAnsi="Calibri" w:cs="Calibri"/>
-        </w:rPr>
-        <w:t xml:space="preserve">Built frontend interface using HTML, CSS, and </w:t>
-      </w:r>
-      <w:r>
-        <w:rPr>
-          <w:rFonts w:ascii="Calibri" w:hAnsi="Calibri" w:cs="Calibri"/>
-        </w:rPr>
-        <w:t>JavaScript</w:t>
-      </w:r>
-    </w:p>
-    <w:p>
-      <w:pPr>
-        <w:pStyle w:val="ListParagraph"/>
-        <w:numPr>
-          <w:ilvl w:val="0"/>
-          <w:numId w:val="1"/>
-        </w:numPr>
-        <w:tabs>
-          <w:tab w:val="left" w:pos="840"/>
-          <w:tab w:val="left" w:pos="841"/>
-        </w:tabs>
-        <w:spacing w:line="240" w:lineRule="exact"/>
-        <w:ind w:left="840" w:right="1064"/>
-        <w:rPr>
-          <w:rFonts w:ascii="Calibri" w:hAnsi="Calibri" w:cs="Calibri"/>
-        </w:rPr>
-      </w:pPr>
-      <w:r>
-        <w:rPr>
-          <w:rFonts w:ascii="Calibri" w:hAnsi="Calibri" w:cs="Calibri"/>
-        </w:rPr>
-        <w:t>Integrated token-based authentication with JWT for secure user sessions</w:t>
-      </w:r>
-    </w:p>
-    <w:p>
-      <w:pPr>
-        <w:pStyle w:val="ListParagraph"/>
-        <w:numPr>
-          <w:ilvl w:val="0"/>
-          <w:numId w:val="1"/>
-        </w:numPr>
-        <w:tabs>
-          <w:tab w:val="left" w:pos="840"/>
-          <w:tab w:val="left" w:pos="841"/>
-        </w:tabs>
-        <w:spacing w:line="240" w:lineRule="exact"/>
-        <w:ind w:left="840" w:right="1064"/>
-        <w:rPr>
-          <w:rFonts w:ascii="Calibri" w:hAnsi="Calibri" w:cs="Calibri"/>
-        </w:rPr>
-      </w:pPr>
-      <w:r>
-        <w:rPr>
-          <w:rFonts w:ascii="Calibri" w:hAnsi="Calibri" w:cs="Calibri"/>
-        </w:rPr>
-        <w:t>Enabled donation-to-rewards system granting loyalty points (OXXO) to users after validated donations</w:t>
-      </w:r>
+        <w:spacing w:before="0" w:line="20" w:lineRule="exact"/>
+        <w:ind w:left="110"/>
+        <w:rPr>
+          <w:rFonts w:ascii="Calibri" w:hAnsi="Calibri" w:cs="Calibri"/>
+          <w:sz w:val="2"/>
+        </w:rPr>
+      </w:pPr>
+    </w:p>
+    <w:p>
+      <w:pPr>
+        <w:pStyle w:val="BodyText"/>
+        <w:spacing w:before="0" w:line="20" w:lineRule="exact"/>
+        <w:ind w:left="110"/>
+        <w:rPr>
+          <w:rFonts w:ascii="Calibri" w:hAnsi="Calibri" w:cs="Calibri"/>
+          <w:sz w:val="2"/>
+        </w:rPr>
+      </w:pPr>
     </w:p>
     <w:p>
       <w:pPr>

</xml_diff>